<commit_message>
docs: fix Module 21 revenue sharing formula — PB1 10% base, DPP-based RS
- Total Tax Deduction = PB1 (Pajak Pembangunan 1) 10%, bukan MDR/PPN
- Formula: PB1 = Amount ÷ 11 (PB1 include dalam harga, rate 10%)
- DPP = Amount − PB1; base revenue sharing adalah DPP, bukan gross amount
- isPb1 flag di AreaRevenueConfig; merchant non-F&B/non-PKP = 0
- VAT 11% tetap dikenakan atas netRevenueSharing (PPN jasa ASG)
- Contoh konkret: Rp 1.597.000 (PB1) dan Rp 370.000 (non-PB1)
- Tambah Pola 7 (validasi MDR) dan Pola 8 (summary JSON)

Co-Authored-By: Claude Sonnet 4.6 <noreply@anthropic.com>
</commit_message>
<xml_diff>
--- a/docs/FSD - CASHPOS PHASE 2.docx
+++ b/docs/FSD - CASHPOS PHASE 2.docx
@@ -31760,7 +31760,7 @@
     </w:p>
     <w:p>
       <w:r>
-        <w:t>Modul Revenue Report menghasilkan laporan revenue sharing antara operator area (ASG) dengan merchant. Setiap transaksi dihitung biaya MDR berdasarkan metode pembayaran, revenue sharing bersih berdasarkan T&amp;C per area, PPN atas revenue sharing, dan total tagihan revenue sharing kepada merchant.</w:t>
+        <w:t>Modul Revenue Report menghasilkan laporan revenue sharing antara operator area (ASG) dengan merchant. Setiap transaksi dihitung potongan PB1 (Pajak Pembangunan 1, 10%), revenue sharing bersih berdasarkan T&amp;C per area dihitung dari DPP (harga setelah dikurangi PB1), PPN 11% atas revenue sharing, dan total tagihan Dealer Fee kepada merchant.</w:t>
       </w:r>
     </w:p>
     <w:p>
@@ -31899,15 +31899,15 @@
         <w:br/>
         <w:t xml:space="preserve">        [HITUNG per baris]</w:t>
         <w:br/>
-        <w:t xml:space="preserve">          MDR Amount           = transactionAmount × mdrRate(paymentType)</w:t>
-        <w:br/>
-        <w:t xml:space="preserve">          Sharing MDR Amount   = MDR Amount × sharingMdrRate(area)</w:t>
-        <w:br/>
-        <w:t xml:space="preserve">          Net Revenue Sharing  = transactionAmount × revenueShareRate(area)</w:t>
-        <w:br/>
-        <w:t xml:space="preserve">          VAT Revenue Sharing  = Net Revenue Sharing × 11%</w:t>
-        <w:br/>
-        <w:t xml:space="preserve">          Total Revenue Sharing = Net Revenue Sharing + VAT Revenue Sharing</w:t>
+        <w:t xml:space="preserve">          PB1 (Tax Deduction)  = transactionAmount ÷ 11  (jika isPb1 = true, else 0)</w:t>
+        <w:br/>
+        <w:t xml:space="preserve">          DPP                  = transactionAmount − PB1</w:t>
+        <w:br/>
+        <w:t xml:space="preserve">          Net Revenue Sharing  = DPP × revenueShareRate(area)</w:t>
+        <w:br/>
+        <w:t xml:space="preserve">          VAT Revenue Sharing  = Net Revenue Sharing × 11%   (PPN atas jasa ASG)</w:t>
+        <w:br/>
+        <w:t xml:space="preserve">          Dealer Fee           = Net Revenue Sharing + VAT Revenue Sharing</w:t>
         <w:br/>
         <w:t xml:space="preserve">              |</w:t>
         <w:br/>
@@ -32512,7 +32512,7 @@
               <w:rPr>
                 <w:sz w:val="18"/>
               </w:rPr>
-              <w:t>mdrAmount</w:t>
+              <w:t>totalTaxDeduction</w:t>
             </w:r>
           </w:p>
         </w:tc>
@@ -32538,7 +32538,7 @@
               <w:rPr>
                 <w:sz w:val="18"/>
               </w:rPr>
-              <w:t>Total biaya MDR = amount × totalMdrRate (ditanggung merchant)</w:t>
+              <w:t>PB1 10% include-tax = amount ÷ 11; bernilai 0 jika merchant tidak kena PB1</w:t>
             </w:r>
           </w:p>
         </w:tc>
@@ -32579,7 +32579,7 @@
               <w:rPr>
                 <w:sz w:val="18"/>
               </w:rPr>
-              <w:t>sharingMdrAmount</w:t>
+              <w:t>dpp</w:t>
             </w:r>
           </w:p>
         </w:tc>
@@ -32605,7 +32605,7 @@
               <w:rPr>
                 <w:sz w:val="18"/>
               </w:rPr>
-              <w:t>Bagian MDR yang masuk ke CZ = mdrAmount − acqMdrAmount</w:t>
+              <w:t>Dasar Pengenaan Pajak = amount − totalTaxDeduction</w:t>
             </w:r>
           </w:p>
         </w:tc>
@@ -32672,7 +32672,7 @@
               <w:rPr>
                 <w:sz w:val="18"/>
               </w:rPr>
-              <w:t>Revenue sharing bersih = amount × revenueShareRate</w:t>
+              <w:t>Revenue sharing bersih = dpp × revenueShareRate</w:t>
             </w:r>
           </w:p>
         </w:tc>
@@ -32739,7 +32739,7 @@
               <w:rPr>
                 <w:sz w:val="18"/>
               </w:rPr>
-              <w:t>PPN 11% dari netRevenueSharing</w:t>
+              <w:t>PPN 11% atas jasa ASG = netRevenueSharing × 11%</w:t>
             </w:r>
           </w:p>
         </w:tc>
@@ -32806,7 +32806,7 @@
               <w:rPr>
                 <w:sz w:val="18"/>
               </w:rPr>
-              <w:t>netRevenueSharing + vatRevenueSharing</w:t>
+              <w:t>Dealer Fee = netRevenueSharing + vatRevenueSharing</w:t>
             </w:r>
           </w:p>
         </w:tc>
@@ -32834,7 +32834,7 @@
           <w:i/>
           <w:color w:val="606060"/>
         </w:rPr>
-        <w:t>Field breakdown MDR per layer (`acqMdrAmount`, `aggMdrAmount`, `agtMdrAmount`, `dealerMdrAmount`) tersedia di export Excel sebagai kolom tambahan, tidak ditampilkan di list default.</w:t>
+        <w:t>**Catatan:** `totalTaxDeduction` adalah PB1 (Pajak Pembangunan 1) — pajak daerah 10% untuk F&amp;B/restoran/hiburan yang sudah termasuk dalam harga transaksi. Berbeda dengan PPN produk. Merchant non-PKP atau jenis usaha non-PB1 akan memiliki nilai 0.</w:t>
       </w:r>
     </w:p>
     <w:p>
@@ -33385,6 +33385,47 @@
           </w:p>
         </w:tc>
       </w:tr>
+      <w:tr>
+        <w:tc>
+          <w:tcPr>
+            <w:tcW w:type="dxa" w:w="2880"/>
+          </w:tcPr>
+          <w:p>
+            <w:r>
+              <w:rPr>
+                <w:sz w:val="18"/>
+              </w:rPr>
+              <w:t>isPb1</w:t>
+            </w:r>
+          </w:p>
+        </w:tc>
+        <w:tc>
+          <w:tcPr>
+            <w:tcW w:type="dxa" w:w="2880"/>
+          </w:tcPr>
+          <w:p>
+            <w:r>
+              <w:rPr>
+                <w:sz w:val="18"/>
+              </w:rPr>
+              <w:t>Boolean</w:t>
+            </w:r>
+          </w:p>
+        </w:tc>
+        <w:tc>
+          <w:tcPr>
+            <w:tcW w:type="dxa" w:w="2880"/>
+          </w:tcPr>
+          <w:p>
+            <w:r>
+              <w:rPr>
+                <w:sz w:val="18"/>
+              </w:rPr>
+              <w:t>true jika merchant di area ini dikenakan PB1 10%; false jika tidak</w:t>
+            </w:r>
+          </w:p>
+        </w:tc>
+      </w:tr>
     </w:tbl>
     <w:p>
       <w:pPr>
@@ -33395,7 +33436,7 @@
           <w:i/>
           <w:color w:val="606060"/>
         </w:rPr>
-        <w:t>PPN 11% bersifat tetap (tidak dikonfigurasi).</w:t>
+        <w:t>PB1 (Pajak Pembangunan 1) = pajak daerah 10% untuk F&amp;B/restoran/hiburan, include dalam harga transaksi. PPN 11% atas jasa ASG bersifat tetap (tidak dikonfigurasi).</w:t>
       </w:r>
     </w:p>
     <w:p>
@@ -33827,19 +33868,19 @@
         <w:rPr>
           <w:color w:val="2F5296"/>
         </w:rPr>
-        <w:t>Pola 1 — MDR Split per Layer (semua layer aktif)</w:t>
-      </w:r>
-    </w:p>
-    <w:p>
-      <w:r>
-        <w:t xml:space="preserve">Total MDR 0.7% dibagi ke 4 komponen; jumlah harus tepat sama dengan </w:t>
+        <w:t>Pola 1 — Ekstraksi PB1 (isPb1 = true)</w:t>
+      </w:r>
+    </w:p>
+    <w:p>
+      <w:r>
+        <w:t xml:space="preserve">PB1 (Pajak Pembangunan 1) 10% sudah termasuk dalam harga transaksi. Diekstrak dengan formula </w:t>
       </w:r>
       <w:r>
         <w:rPr>
           <w:rFonts w:ascii="Courier New" w:hAnsi="Courier New"/>
           <w:sz w:val="18"/>
         </w:rPr>
-        <w:t>totalMdrRate</w:t>
+        <w:t>Amount ÷ 11</w:t>
       </w:r>
       <w:r>
         <w:t>.</w:t>
@@ -33856,28 +33897,20 @@
           <w:rFonts w:ascii="Courier New" w:hAnsi="Courier New"/>
           <w:sz w:val="17"/>
         </w:rPr>
-        <w:t>Amount           : Rp 1.000.000</w:t>
-        <w:br/>
-        <w:t>Payment Type     : QRIS</w:t>
-        <w:br/>
-        <w:t>Total MDR (0.700%): Rp 7.000</w:t>
-        <w:br/>
-        <w:t xml:space="preserve">  ├─ AcqMDR    0.385%  → Rp 3.850   (ke acquirer / payment network)</w:t>
-        <w:br/>
-        <w:t xml:space="preserve">  ├─ AggMDR    0.100%  → Rp 1.000   (ke Agregator)</w:t>
-        <w:br/>
-        <w:t xml:space="preserve">  ├─ AGTMDR    0.100%  → Rp 1.000   (ke Agent)</w:t>
-        <w:br/>
-        <w:t xml:space="preserve">  └─ DealerMDR 0.115%  → Rp 1.150   (ke Dealer)</w:t>
-        <w:br/>
-        <w:t xml:space="preserve">                ──────────────────────</w:t>
-        <w:br/>
-        <w:t xml:space="preserve">  Cek: 0.385 + 0.100 + 0.100 + 0.115 = 0.700 ✓</w:t>
-        <w:br/>
-        <w:br/>
-        <w:t xml:space="preserve">  sharingMdrAmount = mdrAmount − acqMdrAmount</w:t>
-        <w:br/>
-        <w:t xml:space="preserve">                   = Rp 7.000 − Rp 3.850 = Rp 3.150</w:t>
+        <w:t>Mengapa ÷ 11?</w:t>
+        <w:br/>
+        <w:t xml:space="preserve">  Amount = DPP + PB1 = DPP + (DPP × 10%) = DPP × 1.10</w:t>
+        <w:br/>
+        <w:t xml:space="preserve">  PB1    = Amount ÷ 11  →  DPP × 1.10 ÷ 11 = DPP × 10% ✓</w:t>
+        <w:br/>
+        <w:br/>
+        <w:t>Contoh:</w:t>
+        <w:br/>
+        <w:t xml:space="preserve">  Amount                : Rp 1.597.000</w:t>
+        <w:br/>
+        <w:t xml:space="preserve">  totalTaxDeduction PB1 : Rp   145.182   (1.597.000 ÷ 11 = 145.181,8 → dibulatkan)</w:t>
+        <w:br/>
+        <w:t xml:space="preserve">  DPP                   : Rp 1.451.818   (1.597.000 − 145.182)</w:t>
       </w:r>
     </w:p>
     <w:p>
@@ -33888,12 +33921,12 @@
         <w:rPr>
           <w:color w:val="2F5296"/>
         </w:rPr>
-        <w:t>Pola 2 — MDR Split: Layer Agg &amp; AGT tidak ada</w:t>
-      </w:r>
-    </w:p>
-    <w:p>
-      <w:r>
-        <w:t>Jika area tidak memiliki layer Agregator dan Agent, rate-nya 0 dan seluruh sisa CZ MDR ke Dealer.</w:t>
+        <w:t>Pola 2 — Tanpa PB1 (isPb1 = false)</w:t>
+      </w:r>
+    </w:p>
+    <w:p>
+      <w:r>
+        <w:t>Merchant non-F&amp;B, non-PKP, atau jenis usaha yang tidak dikenakan PB1.</w:t>
       </w:r>
     </w:p>
     <w:p>
@@ -33907,26 +33940,11 @@
           <w:rFonts w:ascii="Courier New" w:hAnsi="Courier New"/>
           <w:sz w:val="17"/>
         </w:rPr>
-        <w:t>Amount           : Rp 1.000.000</w:t>
-        <w:br/>
-        <w:t>Payment Type     : QRIS</w:t>
-        <w:br/>
-        <w:t>Total MDR (0.700%): Rp 7.000</w:t>
-        <w:br/>
-        <w:t xml:space="preserve">  ├─ AcqMDR    0.385%  → Rp 3.850</w:t>
-        <w:br/>
-        <w:t xml:space="preserve">  ├─ AggMDR    0.000%  → Rp     0   (tidak ada)</w:t>
-        <w:br/>
-        <w:t xml:space="preserve">  ├─ AGTMDR    0.000%  → Rp     0   (tidak ada)</w:t>
-        <w:br/>
-        <w:t xml:space="preserve">  └─ DealerMDR 0.315%  → Rp 3.150</w:t>
-        <w:br/>
-        <w:t xml:space="preserve">                ──────────────────────</w:t>
-        <w:br/>
-        <w:t xml:space="preserve">  Cek: 0.385 + 0 + 0 + 0.315 = 0.700 ✓</w:t>
-        <w:br/>
-        <w:br/>
-        <w:t xml:space="preserve">  sharingMdrAmount = Rp 7.000 − Rp 3.850 = Rp 3.150</w:t>
+        <w:t xml:space="preserve">  Amount                : Rp   370.000</w:t>
+        <w:br/>
+        <w:t xml:space="preserve">  totalTaxDeduction PB1 : Rp         0   (isPb1 = false)</w:t>
+        <w:br/>
+        <w:t xml:space="preserve">  DPP                   : Rp   370.000   (= Amount)</w:t>
       </w:r>
     </w:p>
     <w:p>
@@ -33937,7 +33955,7 @@
         <w:rPr>
           <w:color w:val="2F5296"/>
         </w:rPr>
-        <w:t>Pola 3 — Revenue Sharing per Area (T&amp;C)</w:t>
+        <w:t>Pola 3 — Revenue Sharing dari DPP</w:t>
       </w:r>
     </w:p>
     <w:p>
@@ -33949,17 +33967,7 @@
         <w:t>revenueShareRate</w:t>
       </w:r>
       <w:r>
-        <w:t xml:space="preserve"> dikonfigurasi per area. PPN 11% selalu dihitung dari </w:t>
-      </w:r>
-      <w:r>
-        <w:rPr>
-          <w:rFonts w:ascii="Courier New" w:hAnsi="Courier New"/>
-          <w:sz w:val="18"/>
-        </w:rPr>
-        <w:t>netRevenueSharing</w:t>
-      </w:r>
-      <w:r>
-        <w:t>.</w:t>
+        <w:t xml:space="preserve"> dikonfigurasi per area (T&amp;C). Basis selalu DPP, bukan Amount gross.</w:t>
       </w:r>
     </w:p>
     <w:p>
@@ -33973,17 +33981,17 @@
           <w:rFonts w:ascii="Courier New" w:hAnsi="Courier New"/>
           <w:sz w:val="17"/>
         </w:rPr>
-        <w:t>Amount              : Rp 1.000.000</w:t>
-        <w:br/>
-        <w:t>revenueShareRate    : 20%   ← T&amp;C area PIK Pantjoran</w:t>
-        <w:br/>
-        <w:t>─────────────────────────────────────────────────────</w:t>
-        <w:br/>
-        <w:t>netRevenueSharing   = Rp 1.000.000 × 20%   = Rp 200.000</w:t>
-        <w:br/>
-        <w:t>vatRevenueSharing   = Rp   200.000 × 11%   = Rp  22.000</w:t>
-        <w:br/>
-        <w:t>totalRevenueSharing = Rp 200.000 + Rp 22.000 = Rp 222.000</w:t>
+        <w:t xml:space="preserve">  DPP                 : Rp 1.451.818</w:t>
+        <w:br/>
+        <w:t xml:space="preserve">  revenueShareRate    : 20%   ← T&amp;C area PIK Pantjoran</w:t>
+        <w:br/>
+        <w:t xml:space="preserve">  ──────────────────────────────────────────────────────</w:t>
+        <w:br/>
+        <w:t xml:space="preserve">  netRevenueSharing   = 1.451.818 × 20%  = Rp   290.364</w:t>
+        <w:br/>
+        <w:t xml:space="preserve">  vatRevenueSharing   = 290.364 × 11%    = Rp    31.940</w:t>
+        <w:br/>
+        <w:t xml:space="preserve">  Dealer Fee          = 290.364 + 31.940 = Rp   322.304</w:t>
       </w:r>
     </w:p>
     <w:p>
@@ -33994,7 +34002,7 @@
         <w:rPr>
           <w:color w:val="2F5296"/>
         </w:rPr>
-        <w:t>Pola 4 — Skenario Lengkap Satu Transaksi (QRIS, tanpa Agg &amp; AGT)</w:t>
+        <w:t>Pola 4 — Skenario Lengkap: Merchant dengan PB1 (Rp 1.597.000)</w:t>
       </w:r>
     </w:p>
     <w:p>
@@ -34012,52 +34020,27 @@
         <w:br/>
         <w:t>Tanggal        : 2026-04-09 12:35</w:t>
         <w:br/>
-        <w:t>Amount         : Rp 1.000.000</w:t>
-        <w:br/>
-        <w:t>Payment Type   : QRIS</w:t>
-        <w:br/>
-        <w:t>Issuer         : DANA</w:t>
-        <w:br/>
-        <w:br/>
-        <w:t>MdrRateConfig (Area: PIK Pantjoran × QRIS):</w:t>
-        <w:br/>
-        <w:t xml:space="preserve">  totalMdrRate  : 0.700%</w:t>
-        <w:br/>
-        <w:t xml:space="preserve">  acqMdrRate    : 0.385%</w:t>
-        <w:br/>
-        <w:t xml:space="preserve">  aggMdrRate    : 0.000%</w:t>
-        <w:br/>
-        <w:t xml:space="preserve">  agtMdrRate    : 0.000%</w:t>
-        <w:br/>
-        <w:t xml:space="preserve">  dealerMdrRate : 0.315%</w:t>
-        <w:br/>
-        <w:br/>
-        <w:t>AreaRevenueConfig (Area: PIK Pantjoran):</w:t>
-        <w:br/>
-        <w:t xml:space="preserve">  revenueShareRate: 20%</w:t>
+        <w:t>Amount         : Rp 1.597.000</w:t>
+        <w:br/>
+        <w:br/>
+        <w:t>AreaRevenueConfig (PIK Pantjoran):</w:t>
+        <w:br/>
+        <w:t xml:space="preserve">  isPb1            : true</w:t>
+        <w:br/>
+        <w:t xml:space="preserve">  revenueShareRate : 20%</w:t>
         <w:br/>
         <w:br/>
         <w:t>Kalkulasi:</w:t>
         <w:br/>
-        <w:t xml:space="preserve">  mdrAmount         = Rp 1.000.000 × 0.700%  = Rp   7.000</w:t>
-        <w:br/>
-        <w:t xml:space="preserve">  acqMdrAmount      = Rp 1.000.000 × 0.385%  = Rp   3.850</w:t>
-        <w:br/>
-        <w:t xml:space="preserve">  aggMdrAmount      = Rp 1.000.000 × 0.000%  = Rp       0</w:t>
-        <w:br/>
-        <w:t xml:space="preserve">  agtMdrAmount      = Rp 1.000.000 × 0.000%  = Rp       0</w:t>
-        <w:br/>
-        <w:t xml:space="preserve">  dealerMdrAmount   = Rp 1.000.000 × 0.315%  = Rp   3.150</w:t>
-        <w:br/>
-        <w:t xml:space="preserve">  sharingMdrAmount  = Rp 7.000 − Rp 3.850    = Rp   3.150</w:t>
-        <w:br/>
-        <w:t xml:space="preserve">  ─────────────────────────────────────────────────────────</w:t>
-        <w:br/>
-        <w:t xml:space="preserve">  netRevenueSharing = Rp 1.000.000 × 20%     = Rp 200.000</w:t>
-        <w:br/>
-        <w:t xml:space="preserve">  vatRevenueSharing = Rp   200.000 × 11%     = Rp  22.000</w:t>
-        <w:br/>
-        <w:t xml:space="preserve">  totalRevenueSharing                         = Rp 222.000</w:t>
+        <w:t xml:space="preserve">  totalTaxDeduction = 1.597.000 ÷ 11         = Rp   145.182</w:t>
+        <w:br/>
+        <w:t xml:space="preserve">  dpp               = 1.597.000 − 145.182     = Rp 1.451.818</w:t>
+        <w:br/>
+        <w:t xml:space="preserve">  netRevenueSharing = 1.451.818 × 20%         = Rp   290.364</w:t>
+        <w:br/>
+        <w:t xml:space="preserve">  vatRevenueSharing = 290.364 × 11%           = Rp    31.940</w:t>
+        <w:br/>
+        <w:t xml:space="preserve">  Dealer Fee        = 290.364 + 31.940        = Rp   322.304</w:t>
       </w:r>
     </w:p>
     <w:p>
@@ -34068,22 +34051,7 @@
         <w:rPr>
           <w:color w:val="2F5296"/>
         </w:rPr>
-        <w:t>Pola 5 — Validasi Konsistensi Rate MDR</w:t>
-      </w:r>
-    </w:p>
-    <w:p>
-      <w:r>
-        <w:t xml:space="preserve">Sistem menolak simpan konfigurasi jika total pecahan tidak sama persis dengan </w:t>
-      </w:r>
-      <w:r>
-        <w:rPr>
-          <w:rFonts w:ascii="Courier New" w:hAnsi="Courier New"/>
-          <w:sz w:val="18"/>
-        </w:rPr>
-        <w:t>totalMdrRate</w:t>
-      </w:r>
-      <w:r>
-        <w:t>:</w:t>
+        <w:t>Pola 5 — Skenario Lengkap: Merchant tanpa PB1 (Rp 370.000)</w:t>
       </w:r>
     </w:p>
     <w:p>
@@ -34097,13 +34065,29 @@
           <w:rFonts w:ascii="Courier New" w:hAnsi="Courier New"/>
           <w:sz w:val="17"/>
         </w:rPr>
-        <w:t>✓  0.385 + 0.000 + 0.000 + 0.315 = 0.700  → valid</w:t>
-        <w:br/>
-        <w:t>✓  0.385 + 0.100 + 0.100 + 0.115 = 0.700  → valid</w:t>
-        <w:br/>
-        <w:t>✗  0.385 + 0.100 + 0.100 + 0.100 = 0.685  → 400: "MDR rate tidak seimbang"</w:t>
-        <w:br/>
-        <w:t>✗  0.385 + 0.200 + 0.100 + 0.115 = 0.800  → 400: "MDR rate tidak seimbang"</w:t>
+        <w:t>Merchant       : Es Kopi (Area: PIK Pantjoran, Subsidiary: Amantara)</w:t>
+        <w:br/>
+        <w:t>Amount         : Rp 370.000</w:t>
+        <w:br/>
+        <w:br/>
+        <w:t>AreaRevenueConfig (PIK Pantjoran):</w:t>
+        <w:br/>
+        <w:t xml:space="preserve">  isPb1            : false</w:t>
+        <w:br/>
+        <w:t xml:space="preserve">  revenueShareRate : 20%</w:t>
+        <w:br/>
+        <w:br/>
+        <w:t>Kalkulasi:</w:t>
+        <w:br/>
+        <w:t xml:space="preserve">  totalTaxDeduction = 0                      = Rp         0</w:t>
+        <w:br/>
+        <w:t xml:space="preserve">  dpp               = 370.000 − 0            = Rp   370.000</w:t>
+        <w:br/>
+        <w:t xml:space="preserve">  netRevenueSharing = 370.000 × 20%          = Rp    74.000</w:t>
+        <w:br/>
+        <w:t xml:space="preserve">  vatRevenueSharing = 74.000 × 11%           = Rp     8.140</w:t>
+        <w:br/>
+        <w:t xml:space="preserve">  Dealer Fee        = 74.000 + 8.140         = Rp    82.140</w:t>
       </w:r>
     </w:p>
     <w:p>
@@ -34114,22 +34098,12 @@
         <w:rPr>
           <w:color w:val="2F5296"/>
         </w:rPr>
-        <w:t>Pola 6 — Rekap Summary per Area</w:t>
-      </w:r>
-    </w:p>
-    <w:p>
-      <w:r>
-        <w:t xml:space="preserve">Response API menyertakan blok </w:t>
-      </w:r>
-      <w:r>
-        <w:rPr>
-          <w:rFonts w:ascii="Courier New" w:hAnsi="Courier New"/>
-          <w:sz w:val="18"/>
-        </w:rPr>
-        <w:t>summary</w:t>
-      </w:r>
-      <w:r>
-        <w:t xml:space="preserve"> berisi agregasi seluruh baris dalam filter:</w:t>
+        <w:t>Pola 6 — MDR Split per Layer</w:t>
+      </w:r>
+    </w:p>
+    <w:p>
+      <w:r>
+        <w:t>MDR dihitung terpisah dari Revenue Sharing dan tidak mempengaruhi base DPP.</w:t>
       </w:r>
     </w:p>
     <w:p>
@@ -34143,6 +34117,92 @@
           <w:rFonts w:ascii="Courier New" w:hAnsi="Courier New"/>
           <w:sz w:val="17"/>
         </w:rPr>
+        <w:t>Amount           : Rp 1.597.000</w:t>
+        <w:br/>
+        <w:t>Payment Type     : QRIS</w:t>
+        <w:br/>
+        <w:br/>
+        <w:t>MdrRateConfig (PIK Pantjoran × QRIS):</w:t>
+        <w:br/>
+        <w:t xml:space="preserve">  totalMdrRate  : 0.700%</w:t>
+        <w:br/>
+        <w:t xml:space="preserve">  acqMdrRate    : 0.385%</w:t>
+        <w:br/>
+        <w:t xml:space="preserve">  aggMdrRate    : 0.000%</w:t>
+        <w:br/>
+        <w:t xml:space="preserve">  agtMdrRate    : 0.000%</w:t>
+        <w:br/>
+        <w:t xml:space="preserve">  dealerMdrRate : 0.315%</w:t>
+        <w:br/>
+        <w:br/>
+        <w:t xml:space="preserve">  mdrAmount         = 1.597.000 × 0.700%  = Rp  11.179</w:t>
+        <w:br/>
+        <w:t xml:space="preserve">  acqMdrAmount      = 1.597.000 × 0.385%  = Rp   6.148</w:t>
+        <w:br/>
+        <w:t xml:space="preserve">  aggMdrAmount      = 0</w:t>
+        <w:br/>
+        <w:t xml:space="preserve">  agtMdrAmount      = 0</w:t>
+        <w:br/>
+        <w:t xml:space="preserve">  dealerMdrAmount   = 1.597.000 × 0.315%  = Rp   5.031</w:t>
+        <w:br/>
+        <w:t xml:space="preserve">  sharingMdrAmount  = 11.179 − 6.148      = Rp   5.031</w:t>
+        <w:br/>
+        <w:t xml:space="preserve">  Cek: 0.385 + 0 + 0 + 0.315 = 0.700 ✓</w:t>
+      </w:r>
+    </w:p>
+    <w:p>
+      <w:pPr>
+        <w:pStyle w:val="Heading4"/>
+      </w:pPr>
+      <w:r>
+        <w:rPr>
+          <w:color w:val="2F5296"/>
+        </w:rPr>
+        <w:t>Pola 7 — Validasi Konsistensi Rate MDR</w:t>
+      </w:r>
+    </w:p>
+    <w:p>
+      <w:pPr>
+        <w:spacing w:before="80" w:after="80"/>
+        <w:ind w:left="360"/>
+        <w:shd w:val="clear" w:color="auto" w:fill="F2F2F2"/>
+      </w:pPr>
+      <w:r>
+        <w:rPr>
+          <w:rFonts w:ascii="Courier New" w:hAnsi="Courier New"/>
+          <w:sz w:val="17"/>
+        </w:rPr>
+        <w:t>✓  0.385 + 0.000 + 0.000 + 0.315 = 0.700  → valid</w:t>
+        <w:br/>
+        <w:t>✓  0.385 + 0.100 + 0.100 + 0.115 = 0.700  → valid</w:t>
+        <w:br/>
+        <w:t>✗  0.385 + 0.100 + 0.100 + 0.100 = 0.685  → 400: "MDR rate tidak seimbang"</w:t>
+        <w:br/>
+        <w:t>✗  0.385 + 0.200 + 0.100 + 0.115 = 0.800  → 400: "MDR rate tidak seimbang"</w:t>
+      </w:r>
+    </w:p>
+    <w:p>
+      <w:pPr>
+        <w:pStyle w:val="Heading4"/>
+      </w:pPr>
+      <w:r>
+        <w:rPr>
+          <w:color w:val="2F5296"/>
+        </w:rPr>
+        <w:t>Pola 8 — Rekap Summary per Area</w:t>
+      </w:r>
+    </w:p>
+    <w:p>
+      <w:pPr>
+        <w:spacing w:before="80" w:after="80"/>
+        <w:ind w:left="360"/>
+        <w:shd w:val="clear" w:color="auto" w:fill="F2F2F2"/>
+      </w:pPr>
+      <w:r>
+        <w:rPr>
+          <w:rFonts w:ascii="Courier New" w:hAnsi="Courier New"/>
+          <w:sz w:val="17"/>
+        </w:rPr>
         <w:t>{</w:t>
         <w:br/>
         <w:t xml:space="preserve">  "summary": {</w:t>
@@ -34151,17 +34211,19 @@
         <w:br/>
         <w:t xml:space="preserve">    "totalTransactionAmount": 250000000,</w:t>
         <w:br/>
+        <w:t xml:space="preserve">    "totalTaxDeduction": 22727273,</w:t>
+        <w:br/>
+        <w:t xml:space="preserve">    "totalDpp": 227272727,</w:t>
+        <w:br/>
         <w:t xml:space="preserve">    "totalMdrAmount": 1750000,</w:t>
         <w:br/>
-        <w:t xml:space="preserve">    "totalAcqMdrAmount": 962500,</w:t>
-        <w:br/>
         <w:t xml:space="preserve">    "totalSharingMdrAmount": 787500,</w:t>
         <w:br/>
-        <w:t xml:space="preserve">    "totalNetRevenueSharing": 50000000,</w:t>
-        <w:br/>
-        <w:t xml:space="preserve">    "totalVatRevenueSharing": 5500000,</w:t>
-        <w:br/>
-        <w:t xml:space="preserve">    "totalRevenueSharing": 55000000</w:t>
+        <w:t xml:space="preserve">    "totalNetRevenueSharing": 45454545,</w:t>
+        <w:br/>
+        <w:t xml:space="preserve">    "totalVatRevenueSharing": 5000000,</w:t>
+        <w:br/>
+        <w:t xml:space="preserve">    "totalDealerFee": 50454545</w:t>
         <w:br/>
         <w:t xml:space="preserve">  }</w:t>
         <w:br/>

</xml_diff>

<commit_message>
docs: revamp product model — VARIANT can have both variant + modifier groups
- Produk VARIANT kini dapat memiliki modifier groups sekaligus (add-on di atas varian)
- additionalPrice pada variant maupun modifier boleh bernilai 0
- Harga final = product.price + variant.additionalPrice + sum(modifier.additionalPrice)
- Tipe Produk table diperbarui: kolom "Dapat Modifier Group?" ditambahkan
- 4 pola konfigurasi: SIMPLE, VARIANT only, MODIFIER only, VARIANT+MODIFIER kombinasi
- Section 2.5 diperbarui: matriks perubahan tipe + operasi yang tetap diizinkan

Co-Authored-By: Claude Sonnet 4.6 <noreply@anthropic.com>
</commit_message>
<xml_diff>
--- a/docs/FSD - CASHPOS PHASE 2.docx
+++ b/docs/FSD - CASHPOS PHASE 2.docx
@@ -2593,7 +2593,26 @@
     </w:p>
     <w:p>
       <w:r>
-        <w:t>Produk yang memiliki variasi berbeda-beda (ukuran, warna, suhu, dll). Setiap kombinasi varian dianggap sebagai SKU yang berbeda dengan harga dan stok masing-masing.</w:t>
+        <w:t xml:space="preserve">Produk yang memiliki variasi berbeda-beda (ukuran, warna, suhu, dll). Setiap opsi varian dapat memiliki </w:t>
+      </w:r>
+      <w:r>
+        <w:rPr>
+          <w:rFonts w:ascii="Courier New" w:hAnsi="Courier New"/>
+          <w:sz w:val="18"/>
+        </w:rPr>
+        <w:t>additionalPrice</w:t>
+      </w:r>
+      <w:r>
+        <w:t xml:space="preserve"> (boleh 0). Stok dikelola per varian. Produk VARIANT </w:t>
+      </w:r>
+      <w:r>
+        <w:rPr>
+          <w:b/>
+        </w:rPr>
+        <w:t>dapat juga memiliki modifier groups</w:t>
+      </w:r>
+      <w:r>
+        <w:t xml:space="preserve"> sebagai add-on di atas varian yang dipilih.</w:t>
       </w:r>
     </w:p>
     <w:p>
@@ -2617,9 +2636,13 @@
         </w:rPr>
         <w:t>product (productType=VARIANT)</w:t>
         <w:br/>
-        <w:t xml:space="preserve">  └── product_variant_group   ← kelompok varian, mis: "Ukuran", "Suhu"</w:t>
-        <w:br/>
-        <w:t xml:space="preserve">        └── product_variant   ← pilihan dalam kelompok, mis: Small, Medium, Large</w:t>
+        <w:t xml:space="preserve">  ├── product_variant_group   ← kelompok varian, mis: "Suhu", "Ukuran"</w:t>
+        <w:br/>
+        <w:t xml:space="preserve">  │     └── product_variant   ← pilihan dalam kelompok, mis: Hot, Ice / S, M, L</w:t>
+        <w:br/>
+        <w:t xml:space="preserve">  └── product_modifier_group  ← (opsional) add-on di atas varian</w:t>
+        <w:br/>
+        <w:t xml:space="preserve">        └── product_modifier  ← pilihan add-on, mis: Extra Shot, Oat Milk</w:t>
       </w:r>
     </w:p>
     <w:p>
@@ -2662,41 +2685,89 @@
         <w:pStyle w:val="ListBullet"/>
       </w:pPr>
       <w:r>
-        <w:t xml:space="preserve">Harga final item = </w:t>
-      </w:r>
-      <w:r>
         <w:rPr>
           <w:rFonts w:ascii="Courier New" w:hAnsi="Courier New"/>
           <w:sz w:val="18"/>
         </w:rPr>
-        <w:t>product.price</w:t>
-      </w:r>
-      <w:r>
-        <w:t xml:space="preserve"> + </w:t>
+        <w:t>variant.additionalPrice</w:t>
+      </w:r>
+      <w:r>
+        <w:t xml:space="preserve"> boleh 0 (contoh: Hot = +Rp 0, Ice = +Rp 0).</w:t>
+      </w:r>
+    </w:p>
+    <w:p>
+      <w:pPr>
+        <w:pStyle w:val="ListBullet"/>
+      </w:pPr>
+      <w:r>
+        <w:t xml:space="preserve">Kasir memilih modifier sesuai </w:t>
       </w:r>
       <w:r>
         <w:rPr>
           <w:rFonts w:ascii="Courier New" w:hAnsi="Courier New"/>
           <w:sz w:val="18"/>
         </w:rPr>
-        <w:t>variant.additionalPrice</w:t>
-      </w:r>
-      <w:r>
-        <w:t>.</w:t>
-      </w:r>
-    </w:p>
-    <w:p>
-      <w:pPr>
-        <w:pStyle w:val="ListBullet"/>
-      </w:pPr>
-      <w:r>
-        <w:t xml:space="preserve">Setiap varian dapat memiliki </w:t>
+        <w:t>minSelect</w:t>
+      </w:r>
+      <w:r>
+        <w:t>/</w:t>
       </w:r>
       <w:r>
         <w:rPr>
           <w:rFonts w:ascii="Courier New" w:hAnsi="Courier New"/>
           <w:sz w:val="18"/>
         </w:rPr>
+        <w:t>maxSelect</w:t>
+      </w:r>
+      <w:r>
+        <w:t xml:space="preserve"> per group (opsional atau wajib).</w:t>
+      </w:r>
+    </w:p>
+    <w:p>
+      <w:pPr>
+        <w:pStyle w:val="ListBullet"/>
+      </w:pPr>
+      <w:r>
+        <w:rPr>
+          <w:rFonts w:ascii="Courier New" w:hAnsi="Courier New"/>
+          <w:sz w:val="18"/>
+        </w:rPr>
+        <w:t>modifier.additionalPrice</w:t>
+      </w:r>
+      <w:r>
+        <w:t xml:space="preserve"> boleh 0 (contoh: "No Sugar" = +Rp 0).</w:t>
+      </w:r>
+    </w:p>
+    <w:p>
+      <w:pPr>
+        <w:pStyle w:val="ListBullet"/>
+      </w:pPr>
+      <w:r>
+        <w:t xml:space="preserve">Harga final = </w:t>
+      </w:r>
+      <w:r>
+        <w:rPr>
+          <w:rFonts w:ascii="Courier New" w:hAnsi="Courier New"/>
+          <w:sz w:val="18"/>
+        </w:rPr>
+        <w:t>product.price + variant.additionalPrice + sum(modifier.additionalPrice)</w:t>
+      </w:r>
+      <w:r>
+        <w:t>.</w:t>
+      </w:r>
+    </w:p>
+    <w:p>
+      <w:pPr>
+        <w:pStyle w:val="ListBullet"/>
+      </w:pPr>
+      <w:r>
+        <w:t xml:space="preserve">Setiap varian dapat memiliki </w:t>
+      </w:r>
+      <w:r>
+        <w:rPr>
+          <w:rFonts w:ascii="Courier New" w:hAnsi="Courier New"/>
+          <w:sz w:val="18"/>
+        </w:rPr>
         <w:t>sku</w:t>
       </w:r>
       <w:r>
@@ -2717,7 +2788,7 @@
         <w:t>per varian</w:t>
       </w:r>
       <w:r>
-        <w:t>, bukan per produk induk.</w:t>
+        <w:t xml:space="preserve"> — modifier tidak memiliki stok tersendiri.</w:t>
       </w:r>
     </w:p>
     <w:p>
@@ -2737,9 +2808,7 @@
         <w:br/>
         <w:t xml:space="preserve">        Simpan Product (productType=VARIANT)</w:t>
         <w:br/>
-        <w:t xml:space="preserve">        (product.price = harga dasar sebelum additional_price varian)</w:t>
-        <w:br/>
-        <w:t xml:space="preserve">        (stok awal product induk = 0, tidak digunakan)</w:t>
+        <w:t xml:space="preserve">        (product.price = harga dasar; stok produk induk tidak digunakan)</w:t>
         <w:br/>
         <w:t xml:space="preserve">              |</w:t>
         <w:br/>
@@ -2751,11 +2820,11 @@
         <w:br/>
         <w:t>[Admin] --&gt; Tambah Variant Option (POST /pos/product/{id}/variant/add)</w:t>
         <w:br/>
-        <w:t xml:space="preserve">        mis: { variantGroupId, name: "Small",  additionalPrice: 0,     sku: "KOPI-S" }</w:t>
-        <w:br/>
-        <w:t xml:space="preserve">             { variantGroupId, name: "Medium", additionalPrice: 5000,  sku: "KOPI-M" }</w:t>
-        <w:br/>
-        <w:t xml:space="preserve">             { variantGroupId, name: "Large",  additionalPrice: 10000, sku: "KOPI-L" }</w:t>
+        <w:t xml:space="preserve">        mis: { variantGroupId, name: "Small",  additionalPrice: 0,      sku: "KOPI-S" }</w:t>
+        <w:br/>
+        <w:t xml:space="preserve">             { variantGroupId, name: "Medium", additionalPrice: 5.000,  sku: "KOPI-M" }</w:t>
+        <w:br/>
+        <w:t xml:space="preserve">             { variantGroupId, name: "Large",  additionalPrice: 10.000, sku: "KOPI-L" }</w:t>
         <w:br/>
         <w:t xml:space="preserve">              |</w:t>
         <w:br/>
@@ -2765,7 +2834,23 @@
         <w:br/>
         <w:t xml:space="preserve">              |</w:t>
         <w:br/>
-        <w:t xml:space="preserve">        Produk + varian aktif dan tersedia di POS</w:t>
+        <w:t>[Admin] --&gt; (Opsional) Tambah Modifier Group (POST /pos/product/{id}/modifier-group/add)</w:t>
+        <w:br/>
+        <w:t xml:space="preserve">        mis: { name: "Topping", isRequired: false, minSelect: 0, maxSelect: 3 }</w:t>
+        <w:br/>
+        <w:t xml:space="preserve">              |</w:t>
+        <w:br/>
+        <w:t>[Admin] --&gt; (Opsional) Tambah Modifier Option (POST /pos/product/{id}/modifier/add)</w:t>
+        <w:br/>
+        <w:t xml:space="preserve">        mis: { modifierGroupId, name: "Extra Shot", additionalPrice: 5.000 }</w:t>
+        <w:br/>
+        <w:t xml:space="preserve">             { modifierGroupId, name: "Oat Milk",   additionalPrice: 8.000 }</w:t>
+        <w:br/>
+        <w:t xml:space="preserve">             { modifierGroupId, name: "No Sugar",   additionalPrice: 0     }</w:t>
+        <w:br/>
+        <w:t xml:space="preserve">              |</w:t>
+        <w:br/>
+        <w:t xml:space="preserve">        Produk + varian (+ modifier opsional) aktif dan tersedia di POS</w:t>
       </w:r>
     </w:p>
     <w:p>
@@ -2795,13 +2880,19 @@
         <w:br/>
         <w:t xml:space="preserve">  |</w:t>
         <w:br/>
-        <w:t>Harga dihitung: product.price + variant.additionalPrice</w:t>
+        <w:t>Kasir memilih modifier (jika ada modifier group) sesuai minSelect/maxSelect</w:t>
         <w:br/>
         <w:t xml:space="preserve">  |</w:t>
         <w:br/>
-        <w:t>TransactionItem disimpan dengan: productId + variantId</w:t>
-        <w:br/>
-        <w:t>Stok dikurangi dari Stock record yang sesuai (productId + variantId)</w:t>
+        <w:t>Harga = product.price + variant.additionalPrice + sum(modifier.additionalPrice)</w:t>
+        <w:br/>
+        <w:t xml:space="preserve">  |</w:t>
+        <w:br/>
+        <w:t>TransactionItem  : productId + variantId</w:t>
+        <w:br/>
+        <w:t>TransactionModifier: per modifier yang dipilih (transactionItemId + modifierId)</w:t>
+        <w:br/>
+        <w:t>Stok dikurangi dari Stock record (productId + variantId)</w:t>
       </w:r>
     </w:p>
     <w:p>
@@ -3087,7 +3178,7 @@
               <w:rPr>
                 <w:sz w:val="18"/>
               </w:rPr>
-              <w:t>Wajib; harus &gt;= 0</w:t>
+              <w:t>Wajib; harus &gt;= 0 (boleh 0)</w:t>
             </w:r>
           </w:p>
         </w:tc>
@@ -3335,7 +3426,7 @@
     </w:p>
     <w:p>
       <w:r>
-        <w:t>Produk yang memiliki pilihan add-on/topping opsional atau wajib. Modifier tidak mengubah identitas produk, melainkan menambah harga dan detail pesanan.</w:t>
+        <w:t>Produk yang hanya memiliki pilihan add-on/topping opsional atau wajib tanpa varian. Stok dikelola di level produk.</w:t>
       </w:r>
     </w:p>
     <w:p>
@@ -3359,7 +3450,7 @@
         </w:rPr>
         <w:t>product (productType=MODIFIER)</w:t>
         <w:br/>
-        <w:t xml:space="preserve">  └── product_modifier_group   ← kelompok add-on, mis: "Topping", "Extra"</w:t>
+        <w:t xml:space="preserve">  └── product_modifier_group   ← kelompok add-on, mis: "Topping", "Level Gula"</w:t>
         <w:br/>
         <w:t xml:space="preserve">        └── product_modifier   ← pilihan dalam kelompok, mis: Extra Shot, Oat Milk</w:t>
       </w:r>
@@ -3377,16 +3468,7 @@
         <w:pStyle w:val="ListBullet"/>
       </w:pPr>
       <w:r>
-        <w:t xml:space="preserve">Kasir dapat memilih </w:t>
-      </w:r>
-      <w:r>
-        <w:rPr>
-          <w:b/>
-        </w:rPr>
-        <w:t>lebih dari satu pilihan</w:t>
-      </w:r>
-      <w:r>
-        <w:t xml:space="preserve"> dalam satu modifier group (diatur oleh </w:t>
+        <w:t xml:space="preserve">Kasir dapat memilih beberapa pilihan dalam satu modifier group (diatur </w:t>
       </w:r>
       <w:r>
         <w:rPr>
@@ -3396,7 +3478,7 @@
         <w:t>minSelect</w:t>
       </w:r>
       <w:r>
-        <w:t xml:space="preserve"> dan </w:t>
+        <w:t>/</w:t>
       </w:r>
       <w:r>
         <w:rPr>
@@ -3434,7 +3516,7 @@
         <w:t>minSelect &gt; 0</w:t>
       </w:r>
       <w:r>
-        <w:t xml:space="preserve">, kasir wajib memilih minimal sejumlah </w:t>
+        <w:t xml:space="preserve">, kasir wajib memilih minimal </w:t>
       </w:r>
       <w:r>
         <w:rPr>
@@ -3444,35 +3526,40 @@
         <w:t>minSelect</w:t>
       </w:r>
       <w:r>
-        <w:t xml:space="preserve"> item dari group tersebut.</w:t>
+        <w:t xml:space="preserve"> item.</w:t>
       </w:r>
     </w:p>
     <w:p>
       <w:pPr>
         <w:pStyle w:val="ListBullet"/>
       </w:pPr>
-      <w:r>
-        <w:t xml:space="preserve">Harga final item = </w:t>
-      </w:r>
       <w:r>
         <w:rPr>
           <w:rFonts w:ascii="Courier New" w:hAnsi="Courier New"/>
           <w:sz w:val="18"/>
         </w:rPr>
-        <w:t>product.price</w:t>
-      </w:r>
-      <w:r>
-        <w:t xml:space="preserve"> + jumlah </w:t>
+        <w:t>modifier.additionalPrice</w:t>
+      </w:r>
+      <w:r>
+        <w:t xml:space="preserve"> boleh 0 (contoh: "Normal Sugar" = +Rp 0, "Less Sugar" = +Rp 0).</w:t>
+      </w:r>
+    </w:p>
+    <w:p>
+      <w:pPr>
+        <w:pStyle w:val="ListBullet"/>
+      </w:pPr>
+      <w:r>
+        <w:t xml:space="preserve">Harga final = </w:t>
       </w:r>
       <w:r>
         <w:rPr>
           <w:rFonts w:ascii="Courier New" w:hAnsi="Courier New"/>
           <w:sz w:val="18"/>
         </w:rPr>
-        <w:t>modifier.additionalPrice</w:t>
-      </w:r>
-      <w:r>
-        <w:t xml:space="preserve"> dari semua modifier yang dipilih.</w:t>
+        <w:t>product.price + sum(modifier.additionalPrice)</w:t>
+      </w:r>
+      <w:r>
+        <w:t>.</w:t>
       </w:r>
     </w:p>
     <w:p>
@@ -3489,7 +3576,7 @@
         <w:t>tidak memiliki stok tersendiri</w:t>
       </w:r>
       <w:r>
-        <w:t xml:space="preserve"> — pengurangan stok tidak dilakukan per modifier.</w:t>
+        <w:t xml:space="preserve"> — stok dipotong dari produk utama.</w:t>
       </w:r>
     </w:p>
     <w:p>
@@ -3515,17 +3602,21 @@
         <w:br/>
         <w:t>[Admin] --&gt; Tambah Modifier Group (POST /pos/product/{id}/modifier-group/add)</w:t>
         <w:br/>
-        <w:t xml:space="preserve">        mis: { name: "Topping", isRequired: false, minSelect: 0, maxSelect: 3 }</w:t>
+        <w:t xml:space="preserve">        mis: { name: "Level Gula", isRequired: true,  minSelect: 1, maxSelect: 1 }</w:t>
+        <w:br/>
+        <w:t xml:space="preserve">             { name: "Topping",    isRequired: false, minSelect: 0, maxSelect: 3 }</w:t>
         <w:br/>
         <w:t xml:space="preserve">              |</w:t>
         <w:br/>
         <w:t>[Admin] --&gt; Tambah Modifier Option (POST /pos/product/{id}/modifier/add)</w:t>
         <w:br/>
-        <w:t xml:space="preserve">        mis: { modifierGroupId, name: "Extra Shot", additionalPrice: 5000 }</w:t>
-        <w:br/>
-        <w:t xml:space="preserve">             { modifierGroupId, name: "Oat Milk",   additionalPrice: 8000 }</w:t>
-        <w:br/>
-        <w:t xml:space="preserve">             { modifierGroupId, name: "Vanilla",    additionalPrice: 3000 }</w:t>
+        <w:t xml:space="preserve">        mis: { modifierGroupId, name: "Normal",     additionalPrice: 0     }</w:t>
+        <w:br/>
+        <w:t xml:space="preserve">             { modifierGroupId, name: "Less Sugar",  additionalPrice: 0     }</w:t>
+        <w:br/>
+        <w:t xml:space="preserve">             { modifierGroupId, name: "Extra Shot",  additionalPrice: 5.000 }</w:t>
+        <w:br/>
+        <w:t xml:space="preserve">             { modifierGroupId, name: "Oat Milk",    additionalPrice: 8.000 }</w:t>
         <w:br/>
         <w:t xml:space="preserve">              |</w:t>
         <w:br/>
@@ -3555,19 +3646,19 @@
         <w:br/>
         <w:t xml:space="preserve">  |</w:t>
         <w:br/>
-        <w:t>Kasir memilih pilihan modifier (opsional / wajib sesuai konfigurasi group)</w:t>
-        <w:br/>
-        <w:t>Validasi: jumlah pilihan harus dalam rentang minSelect ≤ n ≤ maxSelect</w:t>
+        <w:t>Kasir memilih modifier (opsional / wajib sesuai konfigurasi group)</w:t>
+        <w:br/>
+        <w:t>Validasi: minSelect ≤ jumlah pilihan ≤ maxSelect per group</w:t>
         <w:br/>
         <w:t xml:space="preserve">  |</w:t>
         <w:br/>
-        <w:t>Harga dihitung: product.price + sum(modifier.additionalPrice)</w:t>
+        <w:t>Harga = product.price + sum(modifier.additionalPrice)</w:t>
         <w:br/>
         <w:t xml:space="preserve">  |</w:t>
         <w:br/>
-        <w:t>TransactionItem disimpan dengan: productId</w:t>
-        <w:br/>
-        <w:t>TransactionModifier disimpan per modifier yang dipilih (transactionItemId + modifierId)</w:t>
+        <w:t>TransactionItem    : productId (tanpa variantId)</w:t>
+        <w:br/>
+        <w:t>TransactionModifier: per modifier yang dipilih</w:t>
         <w:br/>
         <w:t>Stok dikurangi dari Stock produk utama saja</w:t>
       </w:r>
@@ -3963,7 +4054,7 @@
               <w:rPr>
                 <w:sz w:val="18"/>
               </w:rPr>
-              <w:t>Wajib; harus &gt;= 0</w:t>
+              <w:t>Wajib; harus &gt;= 0 (boleh 0)</w:t>
             </w:r>
           </w:p>
         </w:tc>
@@ -4889,22 +4980,22 @@
                 <w:b/>
                 <w:sz w:val="18"/>
               </w:rPr>
+              <w:t>Dapat Modifier Group?</w:t>
+            </w:r>
+          </w:p>
+        </w:tc>
+        <w:tc>
+          <w:tcPr>
+            <w:tcW w:type="dxa" w:w="2160"/>
+            <w:shd w:val="clear" w:color="auto" w:fill="BDD7EE"/>
+          </w:tcPr>
+          <w:p>
+            <w:r>
+              <w:rPr>
+                <w:b/>
+                <w:sz w:val="18"/>
+              </w:rPr>
               <w:t>Stok</w:t>
-            </w:r>
-          </w:p>
-        </w:tc>
-        <w:tc>
-          <w:tcPr>
-            <w:tcW w:type="dxa" w:w="2160"/>
-            <w:shd w:val="clear" w:color="auto" w:fill="BDD7EE"/>
-          </w:tcPr>
-          <w:p>
-            <w:r>
-              <w:rPr>
-                <w:b/>
-                <w:sz w:val="18"/>
-              </w:rPr>
-              <w:t>Sub-entitas</w:t>
             </w:r>
           </w:p>
         </w:tc>
@@ -4945,20 +5036,20 @@
               <w:rPr>
                 <w:sz w:val="18"/>
               </w:rPr>
+              <w:t>Tidak</w:t>
+            </w:r>
+          </w:p>
+        </w:tc>
+        <w:tc>
+          <w:tcPr>
+            <w:tcW w:type="dxa" w:w="2160"/>
+          </w:tcPr>
+          <w:p>
+            <w:r>
+              <w:rPr>
+                <w:sz w:val="18"/>
+              </w:rPr>
               <w:t>Per produk</w:t>
-            </w:r>
-          </w:p>
-        </w:tc>
-        <w:tc>
-          <w:tcPr>
-            <w:tcW w:type="dxa" w:w="2160"/>
-          </w:tcPr>
-          <w:p>
-            <w:r>
-              <w:rPr>
-                <w:sz w:val="18"/>
-              </w:rPr>
-              <w:t>—</w:t>
             </w:r>
           </w:p>
         </w:tc>
@@ -4986,7 +5077,20 @@
               <w:rPr>
                 <w:sz w:val="18"/>
               </w:rPr>
-              <w:t>Produk dengan beberapa kelompok varian; kasir wajib memilih satu opsi per group</w:t>
+              <w:t>Produk dengan variant groups; kasir wajib pilih satu opsi per required group</w:t>
+            </w:r>
+          </w:p>
+        </w:tc>
+        <w:tc>
+          <w:tcPr>
+            <w:tcW w:type="dxa" w:w="2160"/>
+          </w:tcPr>
+          <w:p>
+            <w:r>
+              <w:rPr>
+                <w:sz w:val="18"/>
+              </w:rPr>
+              <w:t>Ya — modifier sebagai add-on di atas varian</w:t>
             </w:r>
           </w:p>
         </w:tc>
@@ -5000,19 +5104,6 @@
                 <w:sz w:val="18"/>
               </w:rPr>
               <w:t>Per varian</w:t>
-            </w:r>
-          </w:p>
-        </w:tc>
-        <w:tc>
-          <w:tcPr>
-            <w:tcW w:type="dxa" w:w="2160"/>
-          </w:tcPr>
-          <w:p>
-            <w:r>
-              <w:rPr>
-                <w:sz w:val="18"/>
-              </w:rPr>
-              <w:t>product_variant_group, product_variant</w:t>
             </w:r>
           </w:p>
         </w:tc>
@@ -5040,7 +5131,20 @@
               <w:rPr>
                 <w:sz w:val="18"/>
               </w:rPr>
-              <w:t>Produk dengan add-on opsional/wajib; kasir bisa memilih beberapa opsi</w:t>
+              <w:t>Produk dengan modifier groups saja, tanpa varian</w:t>
+            </w:r>
+          </w:p>
+        </w:tc>
+        <w:tc>
+          <w:tcPr>
+            <w:tcW w:type="dxa" w:w="2160"/>
+          </w:tcPr>
+          <w:p>
+            <w:r>
+              <w:rPr>
+                <w:sz w:val="18"/>
+              </w:rPr>
+              <w:t>Ya</w:t>
             </w:r>
           </w:p>
         </w:tc>
@@ -5054,19 +5158,6 @@
                 <w:sz w:val="18"/>
               </w:rPr>
               <w:t>Per produk</w:t>
-            </w:r>
-          </w:p>
-        </w:tc>
-        <w:tc>
-          <w:tcPr>
-            <w:tcW w:type="dxa" w:w="2160"/>
-          </w:tcPr>
-          <w:p>
-            <w:r>
-              <w:rPr>
-                <w:sz w:val="18"/>
-              </w:rPr>
-              <w:t>product_modifier_group, product_modifier</w:t>
             </w:r>
           </w:p>
         </w:tc>
@@ -5080,7 +5171,7 @@
         <w:rPr>
           <w:color w:val="2F5296"/>
         </w:rPr>
-        <w:t>Konfigurasi Produk — Tiga Pola Umum</w:t>
+        <w:t>Konfigurasi Produk — Empat Pola</w:t>
       </w:r>
     </w:p>
     <w:p>
@@ -5088,12 +5179,12 @@
         <w:rPr>
           <w:b/>
         </w:rPr>
-        <w:t>Pola 1 — Produk tanpa variant (SIMPLE)</w:t>
-      </w:r>
-    </w:p>
-    <w:p>
-      <w:r>
-        <w:t>Produk dijual apa adanya, tidak ada pilihan apapun yang perlu dipilih kasir.</w:t>
+        <w:t>Pola 1 — Produk SIMPLE</w:t>
+      </w:r>
+    </w:p>
+    <w:p>
+      <w:r>
+        <w:t>Produk dijual apa adanya, tidak ada pilihan apapun.</w:t>
       </w:r>
     </w:p>
     <w:p>
@@ -5107,14 +5198,14 @@
           <w:rFonts w:ascii="Courier New" w:hAnsi="Courier New"/>
           <w:sz w:val="17"/>
         </w:rPr>
-        <w:t>Produk: Nasi Goreng (Rp 25.000)</w:t>
+        <w:t>Produk: Nasi Goreng (Rp 25.000, productType=SIMPLE)</w:t>
         <w:br/>
         <w:t xml:space="preserve">  └── (tidak ada sub-entitas)</w:t>
         <w:br/>
         <w:br/>
-        <w:t>Kasir: langsung pilih Nasi Goreng → harga Rp 25.000</w:t>
-        <w:br/>
-        <w:t>Stok: dipotong dari stock.productId</w:t>
+        <w:t>Kasir : langsung pilih → harga Rp 25.000</w:t>
+        <w:br/>
+        <w:t>Stok  : dipotong dari stock.productId</w:t>
       </w:r>
     </w:p>
     <w:p>
@@ -5127,12 +5218,22 @@
         <w:rPr>
           <w:b/>
         </w:rPr>
-        <w:t>Pola 2 — Produk dengan variant langsung (VARIANT)</w:t>
-      </w:r>
-    </w:p>
-    <w:p>
-      <w:r>
-        <w:t>Produk memiliki satu atau lebih kelompok varian. Kasir wajib memilih satu opsi dari setiap kelompok yang required. Setiap opsi dapat memiliki SKU dan stok tersendiri.</w:t>
+        <w:t>Pola 2 — Produk VARIANT (tanpa modifier)</w:t>
+      </w:r>
+    </w:p>
+    <w:p>
+      <w:r>
+        <w:t xml:space="preserve">Satu atau lebih variant groups. </w:t>
+      </w:r>
+      <w:r>
+        <w:rPr>
+          <w:rFonts w:ascii="Courier New" w:hAnsi="Courier New"/>
+          <w:sz w:val="18"/>
+        </w:rPr>
+        <w:t>additionalPrice</w:t>
+      </w:r>
+      <w:r>
+        <w:t xml:space="preserve"> boleh 0.</w:t>
       </w:r>
     </w:p>
     <w:p>
@@ -5150,16 +5251,16 @@
         <w:br/>
         <w:t xml:space="preserve">  └── Variant Group: "Suhu" (isRequired=true)</w:t>
         <w:br/>
-        <w:t xml:space="preserve">        ├── Variant: Hot   (additionalPrice=0,    sku="KOPI-H")</w:t>
-        <w:br/>
-        <w:t xml:space="preserve">        └── Variant: Ice   (additionalPrice=2.000, sku="KOPI-I")</w:t>
-        <w:br/>
-        <w:br/>
-        <w:t>Kasir: pilih Kopi → wajib pilih Suhu → pilih "Ice"</w:t>
-        <w:br/>
-        <w:t>Harga: Rp 15.000 + Rp 2.000 = Rp 17.000</w:t>
-        <w:br/>
-        <w:t>Stok: dipotong dari stock(productId=Kopi, variantId=Ice)</w:t>
+        <w:t xml:space="preserve">        ├── Variant: Hot  (additionalPrice=0)      ← tidak ada tambahan harga</w:t>
+        <w:br/>
+        <w:t xml:space="preserve">        └── Variant: Ice  (additionalPrice=2.000)</w:t>
+        <w:br/>
+        <w:br/>
+        <w:t>Kasir : pilih Kopi → pilih "Hot"</w:t>
+        <w:br/>
+        <w:t>Harga : Rp 15.000 + Rp 0 = Rp 15.000</w:t>
+        <w:br/>
+        <w:t>Stok  : dipotong dari stock(productId=Kopi, variantId=Hot)</w:t>
       </w:r>
     </w:p>
     <w:p>
@@ -5172,42 +5273,22 @@
         <w:rPr>
           <w:b/>
         </w:rPr>
-        <w:t>Pola 3 — Produk dengan modifier group dan opsi di dalamnya (MODIFIER)</w:t>
-      </w:r>
-    </w:p>
-    <w:p>
-      <w:r>
-        <w:t xml:space="preserve">Produk memiliki satu atau lebih kelompok add-on. Setiap kelompok memiliki pilihan yang dapat dipilih kasir sesuai batas </w:t>
+        <w:t>Pola 3 — Produk MODIFIER (tanpa variant)</w:t>
+      </w:r>
+    </w:p>
+    <w:p>
+      <w:r>
+        <w:t xml:space="preserve">Satu atau lebih modifier groups. </w:t>
       </w:r>
       <w:r>
         <w:rPr>
           <w:rFonts w:ascii="Courier New" w:hAnsi="Courier New"/>
           <w:sz w:val="18"/>
         </w:rPr>
-        <w:t>minSelect</w:t>
-      </w:r>
-      <w:r>
-        <w:t>/</w:t>
-      </w:r>
-      <w:r>
-        <w:rPr>
-          <w:rFonts w:ascii="Courier New" w:hAnsi="Courier New"/>
-          <w:sz w:val="18"/>
-        </w:rPr>
-        <w:t>maxSelect</w:t>
-      </w:r>
-      <w:r>
-        <w:t xml:space="preserve">. Kasir tidak wajib memilih jika </w:t>
-      </w:r>
-      <w:r>
-        <w:rPr>
-          <w:rFonts w:ascii="Courier New" w:hAnsi="Courier New"/>
-          <w:sz w:val="18"/>
-        </w:rPr>
-        <w:t>isRequired=false</w:t>
-      </w:r>
-      <w:r>
-        <w:t>.</w:t>
+        <w:t>additionalPrice</w:t>
+      </w:r>
+      <w:r>
+        <w:t xml:space="preserve"> boleh 0.</w:t>
       </w:r>
     </w:p>
     <w:p>
@@ -5221,22 +5302,104 @@
           <w:rFonts w:ascii="Courier New" w:hAnsi="Courier New"/>
           <w:sz w:val="17"/>
         </w:rPr>
-        <w:t>Produk: Kopi (harga dasar Rp 15.000, productType=MODIFIER)</w:t>
-        <w:br/>
-        <w:t xml:space="preserve">  └── Modifier Group: "Size" (isRequired=true, minSelect=1, maxSelect=1)</w:t>
-        <w:br/>
-        <w:t xml:space="preserve">        ├── Modifier: Small   (additionalPrice=0)</w:t>
-        <w:br/>
-        <w:t xml:space="preserve">        ├── Modifier: Medium  (additionalPrice=5.000)</w:t>
-        <w:br/>
-        <w:t xml:space="preserve">        └── Modifier: Large   (additionalPrice=10.000)</w:t>
-        <w:br/>
-        <w:br/>
-        <w:t>Kasir: pilih Kopi → wajib pilih Size → pilih "Large"</w:t>
-        <w:br/>
-        <w:t>Harga: Rp 15.000 + Rp 10.000 = Rp 25.000</w:t>
-        <w:br/>
-        <w:t>Stok: dipotong dari stock.productId (Kopi), modifier tidak punya stok sendiri</w:t>
+        <w:t>Produk: Es Teh (harga dasar Rp 8.000, productType=MODIFIER)</w:t>
+        <w:br/>
+        <w:t xml:space="preserve">  └── Modifier Group: "Level Gula" (isRequired=true, minSelect=1, maxSelect=1)</w:t>
+        <w:br/>
+        <w:t xml:space="preserve">        ├── Modifier: Normal Sugar  (additionalPrice=0)   ← tidak ada tambahan</w:t>
+        <w:br/>
+        <w:t xml:space="preserve">        ├── Modifier: Less Sugar    (additionalPrice=0)</w:t>
+        <w:br/>
+        <w:t xml:space="preserve">        └── Modifier: Extra Sweet   (additionalPrice=0)</w:t>
+        <w:br/>
+        <w:br/>
+        <w:t>Kasir : pilih Es Teh → pilih "Less Sugar"</w:t>
+        <w:br/>
+        <w:t>Harga : Rp 8.000 + Rp 0 = Rp 8.000</w:t>
+        <w:br/>
+        <w:t>Stok  : dipotong dari stock.productId (Es Teh)</w:t>
+      </w:r>
+    </w:p>
+    <w:p>
+      <w:r>
+        <w:t>────────────────────────────────────────────────────────────</w:t>
+      </w:r>
+    </w:p>
+    <w:p>
+      <w:r>
+        <w:rPr>
+          <w:b/>
+        </w:rPr>
+        <w:t>Pola 4 — Produk VARIANT dengan Modifier (kombinasi)</w:t>
+      </w:r>
+    </w:p>
+    <w:p>
+      <w:r>
+        <w:t xml:space="preserve">Produk memiliki variant groups (menentukan versi dan stok) sekaligus modifier groups (add-on di atas varian yang dipilih). </w:t>
+      </w:r>
+      <w:r>
+        <w:rPr>
+          <w:rFonts w:ascii="Courier New" w:hAnsi="Courier New"/>
+          <w:sz w:val="18"/>
+        </w:rPr>
+        <w:t>additionalPrice</w:t>
+      </w:r>
+      <w:r>
+        <w:t xml:space="preserve"> pada keduanya boleh 0.</w:t>
+      </w:r>
+    </w:p>
+    <w:p>
+      <w:pPr>
+        <w:spacing w:before="80" w:after="80"/>
+        <w:ind w:left="360"/>
+        <w:shd w:val="clear" w:color="auto" w:fill="F2F2F2"/>
+      </w:pPr>
+      <w:r>
+        <w:rPr>
+          <w:rFonts w:ascii="Courier New" w:hAnsi="Courier New"/>
+          <w:sz w:val="17"/>
+        </w:rPr>
+        <w:t>Produk: Kopi (harga dasar Rp 15.000, productType=VARIANT)</w:t>
+        <w:br/>
+        <w:t xml:space="preserve">  ├── Variant Group: "Ukuran" (isRequired=true)</w:t>
+        <w:br/>
+        <w:t xml:space="preserve">  │     ├── Variant: Small   (additionalPrice=0,      sku="KOPI-S")</w:t>
+        <w:br/>
+        <w:t xml:space="preserve">  │     ├── Variant: Medium  (additionalPrice=5.000,  sku="KOPI-M")</w:t>
+        <w:br/>
+        <w:t xml:space="preserve">  │     └── Variant: Large   (additionalPrice=10.000, sku="KOPI-L")</w:t>
+        <w:br/>
+        <w:t xml:space="preserve">  │</w:t>
+        <w:br/>
+        <w:t xml:space="preserve">  ├── Modifier Group: "Suhu" (isRequired=true, minSelect=1, maxSelect=1)</w:t>
+        <w:br/>
+        <w:t xml:space="preserve">  │     ├── Modifier: Hot   (additionalPrice=0)</w:t>
+        <w:br/>
+        <w:t xml:space="preserve">  │     └── Modifier: Ice   (additionalPrice=0)</w:t>
+        <w:br/>
+        <w:t xml:space="preserve">  │</w:t>
+        <w:br/>
+        <w:t xml:space="preserve">  └── Modifier Group: "Topping" (isRequired=false, minSelect=0, maxSelect=3)</w:t>
+        <w:br/>
+        <w:t xml:space="preserve">        ├── Modifier: Extra Shot  (additionalPrice=5.000)</w:t>
+        <w:br/>
+        <w:t xml:space="preserve">        ├── Modifier: Oat Milk    (additionalPrice=8.000)</w:t>
+        <w:br/>
+        <w:t xml:space="preserve">        └── Modifier: Vanilla     (additionalPrice=3.000)</w:t>
+        <w:br/>
+        <w:br/>
+        <w:t>Kasir : pilih Kopi</w:t>
+        <w:br/>
+        <w:t xml:space="preserve">         → pilih Ukuran: Medium  (+Rp 5.000)</w:t>
+        <w:br/>
+        <w:t xml:space="preserve">         → pilih Suhu  : Ice     (+Rp 0)</w:t>
+        <w:br/>
+        <w:t xml:space="preserve">         → pilih Topping: Extra Shot (+Rp 5.000) + Oat Milk (+Rp 8.000)</w:t>
+        <w:br/>
+        <w:br/>
+        <w:t>Harga : Rp 15.000 + Rp 5.000 + Rp 0 + Rp 5.000 + Rp 8.000 = Rp 33.000</w:t>
+        <w:br/>
+        <w:t>Stok  : dipotong dari stock(productId=Kopi, variantId=Medium)</w:t>
       </w:r>
     </w:p>
     <w:p>
@@ -5248,7 +5411,7 @@
           <w:i/>
           <w:color w:val="606060"/>
         </w:rPr>
-        <w:t>**Catatan:** Modifier group bersifat add-on — satu produk dapat memiliki lebih dari satu modifier group. Contoh: Kopi dengan group "Size" (required, pilih 1) dan group "Topping" (opsional, pilih 0–3).</w:t>
+        <w:t>Modifier group pada produk VARIANT berlaku untuk **semua varian** — tidak bisa dikonfigurasi per varian.</w:t>
       </w:r>
     </w:p>
     <w:p>
@@ -5259,22 +5422,78 @@
         <w:rPr>
           <w:color w:val="2F5296"/>
         </w:rPr>
-        <w:t>2.5 Aturan Perubahan Tipe Produk</w:t>
-      </w:r>
-    </w:p>
-    <w:p>
-      <w:r>
-        <w:t xml:space="preserve">Perubahan </w:t>
+        <w:t>2.5 Aturan Perubahan Tipe Produk &amp; Penambahan Sub-entitas</w:t>
+      </w:r>
+    </w:p>
+    <w:p>
+      <w:r>
+        <w:rPr>
+          <w:b/>
+        </w:rPr>
+        <w:t>Penambahan modifier group ke produk VARIANT yang sudah ada transaksi:</w:t>
+      </w:r>
+    </w:p>
+    <w:p>
+      <w:r>
+        <w:t xml:space="preserve">Diperbolehkan selama modifier baru </w:t>
+      </w:r>
+      <w:r>
+        <w:rPr>
+          <w:b/>
+        </w:rPr>
+        <w:t>tidak merusak transaksi lama</w:t>
+      </w:r>
+      <w:r>
+        <w:t xml:space="preserve"> — transaksi lama tidak punya </w:t>
       </w:r>
       <w:r>
         <w:rPr>
           <w:rFonts w:ascii="Courier New" w:hAnsi="Courier New"/>
           <w:sz w:val="18"/>
         </w:rPr>
+        <w:t>TransactionModifier</w:t>
+      </w:r>
+      <w:r>
+        <w:t xml:space="preserve"> untuk modifier baru, dan itu valid.</w:t>
+      </w:r>
+    </w:p>
+    <w:p>
+      <w:r>
+        <w:rPr>
+          <w:b/>
+        </w:rPr>
+        <w:t>Penambahan variant group ke produk MODIFIER yang sudah ada transaksi:</w:t>
+      </w:r>
+    </w:p>
+    <w:p>
+      <w:r>
+        <w:rPr>
+          <w:b/>
+        </w:rPr>
+        <w:t>Tidak diperbolehkan</w:t>
+      </w:r>
+      <w:r>
+        <w:t xml:space="preserve"> — ini berarti mengubah </w:t>
+      </w:r>
+      <w:r>
+        <w:rPr>
+          <w:rFonts w:ascii="Courier New" w:hAnsi="Courier New"/>
+          <w:sz w:val="18"/>
+        </w:rPr>
         <w:t>productType</w:t>
       </w:r>
       <w:r>
-        <w:t xml:space="preserve"> setelah produk aktif digunakan dalam transaksi memiliki risiko integritas data dan harus mengikuti aturan berikut.</w:t>
+        <w:t xml:space="preserve"> dari MODIFIER ke VARIANT, yang merusak histori stok dan referensi </w:t>
+      </w:r>
+      <w:r>
+        <w:rPr>
+          <w:rFonts w:ascii="Courier New" w:hAnsi="Courier New"/>
+          <w:sz w:val="18"/>
+        </w:rPr>
+        <w:t>variantId</w:t>
+      </w:r>
+      <w:r>
+        <w:t xml:space="preserve"> di transaksi lama.</w:t>
       </w:r>
     </w:p>
     <w:p>
@@ -5282,30 +5501,320 @@
         <w:rPr>
           <w:b/>
         </w:rPr>
-        <w:t>Pertanyaan:</w:t>
-      </w:r>
-      <w:r>
-        <w:t xml:space="preserve"> Bisakah produk yang sudah memiliki variant/modifier dikembalikan ke tipe tanpa variant jika sudah ada transaksi?</w:t>
-      </w:r>
-    </w:p>
+        <w:t>Matriks izin perubahan `productType`:</w:t>
+      </w:r>
+    </w:p>
+    <w:tbl>
+      <w:tblPr>
+        <w:tblStyle w:val="TableGrid"/>
+        <w:tblW w:type="auto" w:w="0"/>
+        <w:tblLook w:firstColumn="1" w:firstRow="1" w:lastColumn="0" w:lastRow="0" w:noHBand="0" w:noVBand="1" w:val="04A0"/>
+      </w:tblPr>
+      <w:tblGrid>
+        <w:gridCol w:w="2880"/>
+        <w:gridCol w:w="2880"/>
+        <w:gridCol w:w="2880"/>
+      </w:tblGrid>
+      <w:tr>
+        <w:tc>
+          <w:tcPr>
+            <w:tcW w:type="dxa" w:w="2880"/>
+            <w:shd w:val="clear" w:color="auto" w:fill="BDD7EE"/>
+          </w:tcPr>
+          <w:p>
+            <w:r>
+              <w:rPr>
+                <w:b/>
+                <w:sz w:val="18"/>
+              </w:rPr>
+              <w:t>Perubahan</w:t>
+            </w:r>
+          </w:p>
+        </w:tc>
+        <w:tc>
+          <w:tcPr>
+            <w:tcW w:type="dxa" w:w="2880"/>
+            <w:shd w:val="clear" w:color="auto" w:fill="BDD7EE"/>
+          </w:tcPr>
+          <w:p>
+            <w:r>
+              <w:rPr>
+                <w:b/>
+                <w:sz w:val="18"/>
+              </w:rPr>
+              <w:t>Belum ada transaksi</w:t>
+            </w:r>
+          </w:p>
+        </w:tc>
+        <w:tc>
+          <w:tcPr>
+            <w:tcW w:type="dxa" w:w="2880"/>
+            <w:shd w:val="clear" w:color="auto" w:fill="BDD7EE"/>
+          </w:tcPr>
+          <w:p>
+            <w:r>
+              <w:rPr>
+                <w:b/>
+                <w:sz w:val="18"/>
+              </w:rPr>
+              <w:t>Sudah ada transaksi</w:t>
+            </w:r>
+          </w:p>
+        </w:tc>
+      </w:tr>
+      <w:tr>
+        <w:tc>
+          <w:tcPr>
+            <w:tcW w:type="dxa" w:w="2880"/>
+          </w:tcPr>
+          <w:p>
+            <w:r>
+              <w:rPr>
+                <w:sz w:val="18"/>
+              </w:rPr>
+              <w:t>SIMPLE → VARIANT</w:t>
+            </w:r>
+          </w:p>
+        </w:tc>
+        <w:tc>
+          <w:tcPr>
+            <w:tcW w:type="dxa" w:w="2880"/>
+          </w:tcPr>
+          <w:p>
+            <w:r>
+              <w:rPr>
+                <w:sz w:val="18"/>
+              </w:rPr>
+              <w:t>✅</w:t>
+            </w:r>
+          </w:p>
+        </w:tc>
+        <w:tc>
+          <w:tcPr>
+            <w:tcW w:type="dxa" w:w="2880"/>
+          </w:tcPr>
+          <w:p>
+            <w:r>
+              <w:rPr>
+                <w:sz w:val="18"/>
+              </w:rPr>
+              <w:t>❌</w:t>
+            </w:r>
+          </w:p>
+        </w:tc>
+      </w:tr>
+      <w:tr>
+        <w:tc>
+          <w:tcPr>
+            <w:tcW w:type="dxa" w:w="2880"/>
+          </w:tcPr>
+          <w:p>
+            <w:r>
+              <w:rPr>
+                <w:sz w:val="18"/>
+              </w:rPr>
+              <w:t>SIMPLE → MODIFIER</w:t>
+            </w:r>
+          </w:p>
+        </w:tc>
+        <w:tc>
+          <w:tcPr>
+            <w:tcW w:type="dxa" w:w="2880"/>
+          </w:tcPr>
+          <w:p>
+            <w:r>
+              <w:rPr>
+                <w:sz w:val="18"/>
+              </w:rPr>
+              <w:t>✅</w:t>
+            </w:r>
+          </w:p>
+        </w:tc>
+        <w:tc>
+          <w:tcPr>
+            <w:tcW w:type="dxa" w:w="2880"/>
+          </w:tcPr>
+          <w:p>
+            <w:r>
+              <w:rPr>
+                <w:sz w:val="18"/>
+              </w:rPr>
+              <w:t>❌</w:t>
+            </w:r>
+          </w:p>
+        </w:tc>
+      </w:tr>
+      <w:tr>
+        <w:tc>
+          <w:tcPr>
+            <w:tcW w:type="dxa" w:w="2880"/>
+          </w:tcPr>
+          <w:p>
+            <w:r>
+              <w:rPr>
+                <w:sz w:val="18"/>
+              </w:rPr>
+              <w:t>VARIANT → SIMPLE</w:t>
+            </w:r>
+          </w:p>
+        </w:tc>
+        <w:tc>
+          <w:tcPr>
+            <w:tcW w:type="dxa" w:w="2880"/>
+          </w:tcPr>
+          <w:p>
+            <w:r>
+              <w:rPr>
+                <w:sz w:val="18"/>
+              </w:rPr>
+              <w:t>✅</w:t>
+            </w:r>
+          </w:p>
+        </w:tc>
+        <w:tc>
+          <w:tcPr>
+            <w:tcW w:type="dxa" w:w="2880"/>
+          </w:tcPr>
+          <w:p>
+            <w:r>
+              <w:rPr>
+                <w:sz w:val="18"/>
+              </w:rPr>
+              <w:t>❌</w:t>
+            </w:r>
+          </w:p>
+        </w:tc>
+      </w:tr>
+      <w:tr>
+        <w:tc>
+          <w:tcPr>
+            <w:tcW w:type="dxa" w:w="2880"/>
+          </w:tcPr>
+          <w:p>
+            <w:r>
+              <w:rPr>
+                <w:sz w:val="18"/>
+              </w:rPr>
+              <w:t>VARIANT → MODIFIER</w:t>
+            </w:r>
+          </w:p>
+        </w:tc>
+        <w:tc>
+          <w:tcPr>
+            <w:tcW w:type="dxa" w:w="2880"/>
+          </w:tcPr>
+          <w:p>
+            <w:r>
+              <w:rPr>
+                <w:sz w:val="18"/>
+              </w:rPr>
+              <w:t>✅</w:t>
+            </w:r>
+          </w:p>
+        </w:tc>
+        <w:tc>
+          <w:tcPr>
+            <w:tcW w:type="dxa" w:w="2880"/>
+          </w:tcPr>
+          <w:p>
+            <w:r>
+              <w:rPr>
+                <w:sz w:val="18"/>
+              </w:rPr>
+              <w:t>❌</w:t>
+            </w:r>
+          </w:p>
+        </w:tc>
+      </w:tr>
+      <w:tr>
+        <w:tc>
+          <w:tcPr>
+            <w:tcW w:type="dxa" w:w="2880"/>
+          </w:tcPr>
+          <w:p>
+            <w:r>
+              <w:rPr>
+                <w:sz w:val="18"/>
+              </w:rPr>
+              <w:t>MODIFIER → SIMPLE</w:t>
+            </w:r>
+          </w:p>
+        </w:tc>
+        <w:tc>
+          <w:tcPr>
+            <w:tcW w:type="dxa" w:w="2880"/>
+          </w:tcPr>
+          <w:p>
+            <w:r>
+              <w:rPr>
+                <w:sz w:val="18"/>
+              </w:rPr>
+              <w:t>✅</w:t>
+            </w:r>
+          </w:p>
+        </w:tc>
+        <w:tc>
+          <w:tcPr>
+            <w:tcW w:type="dxa" w:w="2880"/>
+          </w:tcPr>
+          <w:p>
+            <w:r>
+              <w:rPr>
+                <w:sz w:val="18"/>
+              </w:rPr>
+              <w:t>❌</w:t>
+            </w:r>
+          </w:p>
+        </w:tc>
+      </w:tr>
+      <w:tr>
+        <w:tc>
+          <w:tcPr>
+            <w:tcW w:type="dxa" w:w="2880"/>
+          </w:tcPr>
+          <w:p>
+            <w:r>
+              <w:rPr>
+                <w:sz w:val="18"/>
+              </w:rPr>
+              <w:t>MODIFIER → VARIANT</w:t>
+            </w:r>
+          </w:p>
+        </w:tc>
+        <w:tc>
+          <w:tcPr>
+            <w:tcW w:type="dxa" w:w="2880"/>
+          </w:tcPr>
+          <w:p>
+            <w:r>
+              <w:rPr>
+                <w:sz w:val="18"/>
+              </w:rPr>
+              <w:t>✅</w:t>
+            </w:r>
+          </w:p>
+        </w:tc>
+        <w:tc>
+          <w:tcPr>
+            <w:tcW w:type="dxa" w:w="2880"/>
+          </w:tcPr>
+          <w:p>
+            <w:r>
+              <w:rPr>
+                <w:sz w:val="18"/>
+              </w:rPr>
+              <w:t>❌</w:t>
+            </w:r>
+          </w:p>
+        </w:tc>
+      </w:tr>
+    </w:tbl>
     <w:p>
       <w:r>
         <w:rPr>
           <w:b/>
         </w:rPr>
-        <w:t>Jawaban:</w:t>
-      </w:r>
-      <w:r>
-        <w:t xml:space="preserve"> </w:t>
-      </w:r>
-      <w:r>
-        <w:rPr>
-          <w:b/>
-        </w:rPr>
-        <w:t>Tidak bisa</w:t>
-      </w:r>
-      <w:r>
-        <w:t>, selama produk tersebut masih terhubung ke transaksi (baik PAID maupun PENDING). Alasannya:</w:t>
+        <w:t>Alasan blokir jika sudah ada transaksi:</w:t>
       </w:r>
     </w:p>
     <w:tbl>
@@ -5373,7 +5882,7 @@
               <w:rPr>
                 <w:sz w:val="18"/>
               </w:rPr>
-              <w:t>transaction_items.variant_id menyimpan referensi ke varian yang dipilih. Jika varian dihapus atau tipe diubah, data histori tidak bisa diinterpretasikan</w:t>
+              <w:t>transaction_items.variant_id mereferensi varian yang dipilih; jika tipe berubah, data histori tidak bisa diinterpretasikan</w:t>
             </w:r>
           </w:p>
         </w:tc>
@@ -5401,7 +5910,7 @@
               <w:rPr>
                 <w:sz w:val="18"/>
               </w:rPr>
-              <w:t>Stok produk VARIANT dikelola per varian — tidak ada cara otomatis untuk menggabungkan stok beberapa varian menjadi satu</w:t>
+              <w:t>Stok VARIANT dikelola per varian — tidak bisa digabung otomatis ke satu stok produk</w:t>
             </w:r>
           </w:p>
         </w:tc>
@@ -5429,7 +5938,7 @@
               <w:rPr>
                 <w:sz w:val="18"/>
               </w:rPr>
-              <w:t>Laporan produk terlaris yang memiliki breakdown per varian akan rusak</w:t>
+              <w:t>Breakdown per varian di laporan akan rusak</w:t>
             </w:r>
           </w:p>
         </w:tc>
@@ -5440,7 +5949,7 @@
         <w:rPr>
           <w:b/>
         </w:rPr>
-        <w:t>Matriks izin perubahan tipe:</w:t>
+        <w:t>Operasi yang tetap diperbolehkan meski sudah ada transaksi:</w:t>
       </w:r>
     </w:p>
     <w:tbl>
@@ -5450,16 +5959,13 @@
         <w:tblLook w:firstColumn="1" w:firstRow="1" w:lastColumn="0" w:lastRow="0" w:noHBand="0" w:noVBand="1" w:val="04A0"/>
       </w:tblPr>
       <w:tblGrid>
-        <w:gridCol w:w="1728"/>
-        <w:gridCol w:w="1728"/>
-        <w:gridCol w:w="1728"/>
-        <w:gridCol w:w="1728"/>
-        <w:gridCol w:w="1728"/>
+        <w:gridCol w:w="4320"/>
+        <w:gridCol w:w="4320"/>
       </w:tblGrid>
       <w:tr>
         <w:tc>
           <w:tcPr>
-            <w:tcW w:type="dxa" w:w="1728"/>
+            <w:tcW w:type="dxa" w:w="4320"/>
             <w:shd w:val="clear" w:color="auto" w:fill="BDD7EE"/>
           </w:tcPr>
           <w:p>
@@ -5468,13 +5974,13 @@
                 <w:b/>
                 <w:sz w:val="18"/>
               </w:rPr>
-              <w:t>Kondisi Produk</w:t>
-            </w:r>
-          </w:p>
-        </w:tc>
-        <w:tc>
-          <w:tcPr>
-            <w:tcW w:type="dxa" w:w="1728"/>
+              <w:t>Operasi</w:t>
+            </w:r>
+          </w:p>
+        </w:tc>
+        <w:tc>
+          <w:tcPr>
+            <w:tcW w:type="dxa" w:w="4320"/>
             <w:shd w:val="clear" w:color="auto" w:fill="BDD7EE"/>
           </w:tcPr>
           <w:p>
@@ -5483,52 +5989,7 @@
                 <w:b/>
                 <w:sz w:val="18"/>
               </w:rPr>
-              <w:t>SIMPLE → VARIANT</w:t>
-            </w:r>
-          </w:p>
-        </w:tc>
-        <w:tc>
-          <w:tcPr>
-            <w:tcW w:type="dxa" w:w="1728"/>
-            <w:shd w:val="clear" w:color="auto" w:fill="BDD7EE"/>
-          </w:tcPr>
-          <w:p>
-            <w:r>
-              <w:rPr>
-                <w:b/>
-                <w:sz w:val="18"/>
-              </w:rPr>
-              <w:t>SIMPLE → MODIFIER</w:t>
-            </w:r>
-          </w:p>
-        </w:tc>
-        <w:tc>
-          <w:tcPr>
-            <w:tcW w:type="dxa" w:w="1728"/>
-            <w:shd w:val="clear" w:color="auto" w:fill="BDD7EE"/>
-          </w:tcPr>
-          <w:p>
-            <w:r>
-              <w:rPr>
-                <w:b/>
-                <w:sz w:val="18"/>
-              </w:rPr>
-              <w:t>VARIANT → SIMPLE</w:t>
-            </w:r>
-          </w:p>
-        </w:tc>
-        <w:tc>
-          <w:tcPr>
-            <w:tcW w:type="dxa" w:w="1728"/>
-            <w:shd w:val="clear" w:color="auto" w:fill="BDD7EE"/>
-          </w:tcPr>
-          <w:p>
-            <w:r>
-              <w:rPr>
-                <w:b/>
-                <w:sz w:val="18"/>
-              </w:rPr>
-              <w:t>MODIFIER → SIMPLE</w:t>
+              <w:t>Kondisi</w:t>
             </w:r>
           </w:p>
         </w:tc>
@@ -5536,66 +5997,27 @@
       <w:tr>
         <w:tc>
           <w:tcPr>
-            <w:tcW w:type="dxa" w:w="1728"/>
-          </w:tcPr>
-          <w:p>
-            <w:r>
-              <w:rPr>
-                <w:sz w:val="18"/>
-              </w:rPr>
-              <w:t>Belum pernah ditransaksikan</w:t>
-            </w:r>
-          </w:p>
-        </w:tc>
-        <w:tc>
-          <w:tcPr>
-            <w:tcW w:type="dxa" w:w="1728"/>
-          </w:tcPr>
-          <w:p>
-            <w:r>
-              <w:rPr>
-                <w:sz w:val="18"/>
-              </w:rPr>
-              <w:t>✅</w:t>
-            </w:r>
-          </w:p>
-        </w:tc>
-        <w:tc>
-          <w:tcPr>
-            <w:tcW w:type="dxa" w:w="1728"/>
-          </w:tcPr>
-          <w:p>
-            <w:r>
-              <w:rPr>
-                <w:sz w:val="18"/>
-              </w:rPr>
-              <w:t>✅</w:t>
-            </w:r>
-          </w:p>
-        </w:tc>
-        <w:tc>
-          <w:tcPr>
-            <w:tcW w:type="dxa" w:w="1728"/>
-          </w:tcPr>
-          <w:p>
-            <w:r>
-              <w:rPr>
-                <w:sz w:val="18"/>
-              </w:rPr>
-              <w:t>✅</w:t>
-            </w:r>
-          </w:p>
-        </w:tc>
-        <w:tc>
-          <w:tcPr>
-            <w:tcW w:type="dxa" w:w="1728"/>
-          </w:tcPr>
-          <w:p>
-            <w:r>
-              <w:rPr>
-                <w:sz w:val="18"/>
-              </w:rPr>
-              <w:t>✅</w:t>
+            <w:tcW w:type="dxa" w:w="4320"/>
+          </w:tcPr>
+          <w:p>
+            <w:r>
+              <w:rPr>
+                <w:sz w:val="18"/>
+              </w:rPr>
+              <w:t>Tambah modifier group ke produk VARIANT</w:t>
+            </w:r>
+          </w:p>
+        </w:tc>
+        <w:tc>
+          <w:tcPr>
+            <w:tcW w:type="dxa" w:w="4320"/>
+          </w:tcPr>
+          <w:p>
+            <w:r>
+              <w:rPr>
+                <w:sz w:val="18"/>
+              </w:rPr>
+              <w:t>✅ selalu boleh</w:t>
             </w:r>
           </w:p>
         </w:tc>
@@ -5603,66 +6025,27 @@
       <w:tr>
         <w:tc>
           <w:tcPr>
-            <w:tcW w:type="dxa" w:w="1728"/>
-          </w:tcPr>
-          <w:p>
-            <w:r>
-              <w:rPr>
-                <w:sz w:val="18"/>
-              </w:rPr>
-              <w:t>Sudah ada transaksi, semua varian inactive</w:t>
-            </w:r>
-          </w:p>
-        </w:tc>
-        <w:tc>
-          <w:tcPr>
-            <w:tcW w:type="dxa" w:w="1728"/>
-          </w:tcPr>
-          <w:p>
-            <w:r>
-              <w:rPr>
-                <w:sz w:val="18"/>
-              </w:rPr>
-              <w:t>❌</w:t>
-            </w:r>
-          </w:p>
-        </w:tc>
-        <w:tc>
-          <w:tcPr>
-            <w:tcW w:type="dxa" w:w="1728"/>
-          </w:tcPr>
-          <w:p>
-            <w:r>
-              <w:rPr>
-                <w:sz w:val="18"/>
-              </w:rPr>
-              <w:t>❌</w:t>
-            </w:r>
-          </w:p>
-        </w:tc>
-        <w:tc>
-          <w:tcPr>
-            <w:tcW w:type="dxa" w:w="1728"/>
-          </w:tcPr>
-          <w:p>
-            <w:r>
-              <w:rPr>
-                <w:sz w:val="18"/>
-              </w:rPr>
-              <w:t>❌</w:t>
-            </w:r>
-          </w:p>
-        </w:tc>
-        <w:tc>
-          <w:tcPr>
-            <w:tcW w:type="dxa" w:w="1728"/>
-          </w:tcPr>
-          <w:p>
-            <w:r>
-              <w:rPr>
-                <w:sz w:val="18"/>
-              </w:rPr>
-              <w:t>❌</w:t>
+            <w:tcW w:type="dxa" w:w="4320"/>
+          </w:tcPr>
+          <w:p>
+            <w:r>
+              <w:rPr>
+                <w:sz w:val="18"/>
+              </w:rPr>
+              <w:t>Tambah modifier option baru</w:t>
+            </w:r>
+          </w:p>
+        </w:tc>
+        <w:tc>
+          <w:tcPr>
+            <w:tcW w:type="dxa" w:w="4320"/>
+          </w:tcPr>
+          <w:p>
+            <w:r>
+              <w:rPr>
+                <w:sz w:val="18"/>
+              </w:rPr>
+              <w:t>✅ selalu boleh</w:t>
             </w:r>
           </w:p>
         </w:tc>
@@ -5670,66 +6053,83 @@
       <w:tr>
         <w:tc>
           <w:tcPr>
-            <w:tcW w:type="dxa" w:w="1728"/>
-          </w:tcPr>
-          <w:p>
-            <w:r>
-              <w:rPr>
-                <w:sz w:val="18"/>
-              </w:rPr>
-              <w:t>Sudah ada transaksi</w:t>
-            </w:r>
-          </w:p>
-        </w:tc>
-        <w:tc>
-          <w:tcPr>
-            <w:tcW w:type="dxa" w:w="1728"/>
-          </w:tcPr>
-          <w:p>
-            <w:r>
-              <w:rPr>
-                <w:sz w:val="18"/>
-              </w:rPr>
-              <w:t>❌</w:t>
-            </w:r>
-          </w:p>
-        </w:tc>
-        <w:tc>
-          <w:tcPr>
-            <w:tcW w:type="dxa" w:w="1728"/>
-          </w:tcPr>
-          <w:p>
-            <w:r>
-              <w:rPr>
-                <w:sz w:val="18"/>
-              </w:rPr>
-              <w:t>❌</w:t>
-            </w:r>
-          </w:p>
-        </w:tc>
-        <w:tc>
-          <w:tcPr>
-            <w:tcW w:type="dxa" w:w="1728"/>
-          </w:tcPr>
-          <w:p>
-            <w:r>
-              <w:rPr>
-                <w:sz w:val="18"/>
-              </w:rPr>
-              <w:t>❌</w:t>
-            </w:r>
-          </w:p>
-        </w:tc>
-        <w:tc>
-          <w:tcPr>
-            <w:tcW w:type="dxa" w:w="1728"/>
-          </w:tcPr>
-          <w:p>
-            <w:r>
-              <w:rPr>
-                <w:sz w:val="18"/>
-              </w:rPr>
-              <w:t>❌</w:t>
+            <w:tcW w:type="dxa" w:w="4320"/>
+          </w:tcPr>
+          <w:p>
+            <w:r>
+              <w:rPr>
+                <w:sz w:val="18"/>
+              </w:rPr>
+              <w:t>Tambah variant option baru ke group yang ada</w:t>
+            </w:r>
+          </w:p>
+        </w:tc>
+        <w:tc>
+          <w:tcPr>
+            <w:tcW w:type="dxa" w:w="4320"/>
+          </w:tcPr>
+          <w:p>
+            <w:r>
+              <w:rPr>
+                <w:sz w:val="18"/>
+              </w:rPr>
+              <w:t>✅ boleh, buat Stock record baru</w:t>
+            </w:r>
+          </w:p>
+        </w:tc>
+      </w:tr>
+      <w:tr>
+        <w:tc>
+          <w:tcPr>
+            <w:tcW w:type="dxa" w:w="4320"/>
+          </w:tcPr>
+          <w:p>
+            <w:r>
+              <w:rPr>
+                <w:sz w:val="18"/>
+              </w:rPr>
+              <w:t>Nonaktifkan variant/modifier (isActive=false)</w:t>
+            </w:r>
+          </w:p>
+        </w:tc>
+        <w:tc>
+          <w:tcPr>
+            <w:tcW w:type="dxa" w:w="4320"/>
+          </w:tcPr>
+          <w:p>
+            <w:r>
+              <w:rPr>
+                <w:sz w:val="18"/>
+              </w:rPr>
+              <w:t>✅ jika tidak ada transaksi PENDING</w:t>
+            </w:r>
+          </w:p>
+        </w:tc>
+      </w:tr>
+      <w:tr>
+        <w:tc>
+          <w:tcPr>
+            <w:tcW w:type="dxa" w:w="4320"/>
+          </w:tcPr>
+          <w:p>
+            <w:r>
+              <w:rPr>
+                <w:sz w:val="18"/>
+              </w:rPr>
+              <w:t>Edit additionalPrice variant/modifier</w:t>
+            </w:r>
+          </w:p>
+        </w:tc>
+        <w:tc>
+          <w:tcPr>
+            <w:tcW w:type="dxa" w:w="4320"/>
+          </w:tcPr>
+          <w:p>
+            <w:r>
+              <w:rPr>
+                <w:sz w:val="18"/>
+              </w:rPr>
+              <w:t>✅ tidak mempengaruhi transaksi lama (snapshot sudah tersimpan)</w:t>
             </w:r>
           </w:p>
         </w:tc>
@@ -5740,7 +6140,7 @@
         <w:rPr>
           <w:b/>
         </w:rPr>
-        <w:t>Alternatif yang direkomendasikan jika produk perlu diganti tipe:</w:t>
+        <w:t>Alternatif jika produk perlu ganti tipe:</w:t>
       </w:r>
     </w:p>
     <w:p>
@@ -5754,7 +6154,7 @@
           <w:rFonts w:ascii="Courier New" w:hAnsi="Courier New"/>
           <w:sz w:val="17"/>
         </w:rPr>
-        <w:t>Produk lama (VARIANT/MODIFIER) sudah ada transaksi</w:t>
+        <w:t>Produk lama sudah ada transaksi</w:t>
         <w:br/>
         <w:t xml:space="preserve">  |</w:t>
         <w:br/>
@@ -5768,43 +6168,9 @@
         <w:br/>
         <w:t xml:space="preserve">  └── Opsi 2: Nonaktifkan semua varian/modifier (isActive=false)</w:t>
         <w:br/>
-        <w:t xml:space="preserve">              Produk tetap berjalan tapi kasir tidak perlu memilih opsi apapun</w:t>
-        <w:br/>
-        <w:t xml:space="preserve">              (tidak mengubah productType, histori tetap valid)</w:t>
-      </w:r>
-    </w:p>
-    <w:p>
-      <w:r>
-        <w:rPr>
-          <w:b/>
-        </w:rPr>
-        <w:t>Alur nonaktifkan varian:</w:t>
-      </w:r>
-    </w:p>
-    <w:p>
-      <w:pPr>
-        <w:spacing w:before="80" w:after="80"/>
-        <w:ind w:left="360"/>
-        <w:shd w:val="clear" w:color="auto" w:fill="F2F2F2"/>
-      </w:pPr>
-      <w:r>
-        <w:rPr>
-          <w:rFonts w:ascii="Courier New" w:hAnsi="Courier New"/>
-          <w:sz w:val="17"/>
-        </w:rPr>
-        <w:t>[Admin] --&gt; PUT /pos/product/{id}/variant/{variantId}</w:t>
-        <w:br/>
-        <w:t xml:space="preserve">        { isActive: false }</w:t>
-        <w:br/>
-        <w:t xml:space="preserve">              |</w:t>
-        <w:br/>
-        <w:t xml:space="preserve">        Validasi: tidak ada transaksi PENDING yang menggunakan variantId ini</w:t>
-        <w:br/>
-        <w:t xml:space="preserve">              |</w:t>
-        <w:br/>
-        <w:t xml:space="preserve">        Set variant.isActive = false</w:t>
-        <w:br/>
-        <w:t xml:space="preserve">        Variant tidak muncul di POS, tetapi data histori tetap ada</w:t>
+        <w:t xml:space="preserve">              Produk tetap berjalan tapi kasir tidak perlu memilih opsi</w:t>
+        <w:br/>
+        <w:t xml:space="preserve">              (productType tidak berubah, histori tetap valid)</w:t>
       </w:r>
     </w:p>
     <w:p>

</xml_diff>